<commit_message>
docs: add education profiles and procedure filters to FNP briefs
</commit_message>
<xml_diff>
--- a/docs/sciezka wejscia do  firmy – Safe Space (uwagi Pawła).docx
+++ b/docs/sciezka wejscia do  firmy – Safe Space (uwagi Pawła).docx
@@ -5,26 +5,76 @@
     <w:p>
       <w:pPr>
         <w:pStyle w:val="Nagwek1"/>
-      </w:pPr>
-      <w:r>
-        <w:t>Ścieżka wejścia do firmy – Safe Space</w:t>
-      </w:r>
-    </w:p>
-    <w:p>
-      <w:r>
-        <w:t>Oct 3, 2026 · @Marta</w:t>
+        <w:rPr>
+          <w:lang w:val="pl-PL"/>
+        </w:rPr>
+      </w:pPr>
+      <w:r>
+        <w:rPr>
+          <w:lang w:val="pl-PL"/>
+        </w:rPr>
+        <w:t xml:space="preserve">Ścieżka wejścia do firmy – </w:t>
+      </w:r>
+      <w:proofErr w:type="spellStart"/>
+      <w:r>
+        <w:rPr>
+          <w:lang w:val="pl-PL"/>
+        </w:rPr>
+        <w:t>Safe</w:t>
+      </w:r>
+      <w:proofErr w:type="spellEnd"/>
+      <w:r>
+        <w:rPr>
+          <w:lang w:val="pl-PL"/>
+        </w:rPr>
+        <w:t xml:space="preserve"> Space</w:t>
+      </w:r>
+    </w:p>
+    <w:p>
+      <w:pPr>
+        <w:rPr>
+          <w:lang w:val="pl-PL"/>
+        </w:rPr>
+      </w:pPr>
+      <w:proofErr w:type="spellStart"/>
+      <w:r>
+        <w:rPr>
+          <w:lang w:val="pl-PL"/>
+        </w:rPr>
+        <w:t>Oct</w:t>
+      </w:r>
+      <w:proofErr w:type="spellEnd"/>
+      <w:r>
+        <w:rPr>
+          <w:lang w:val="pl-PL"/>
+        </w:rPr>
+        <w:t xml:space="preserve"> 3, 2026 · @Marta</w:t>
       </w:r>
     </w:p>
     <w:p>
       <w:pPr>
         <w:pStyle w:val="Nagwek2"/>
-      </w:pPr>
-      <w:r>
+        <w:rPr>
+          <w:lang w:val="pl-PL"/>
+        </w:rPr>
+      </w:pPr>
+      <w:r>
+        <w:rPr>
+          <w:lang w:val="pl-PL"/>
+        </w:rPr>
         <w:t>Cel i miejsce ścieżki w ofercie</w:t>
       </w:r>
     </w:p>
     <w:p>
-      <w:r>
+      <w:pPr>
+        <w:rPr>
+          <w:lang w:val="pl-PL"/>
+        </w:rPr>
+      </w:pPr>
+      <w:r>
+        <w:rPr>
+          <w:lang w:val="pl-PL"/>
+        </w:rPr>
         <w:t xml:space="preserve">Ścieżka „Sprawdź, jak to jest u was” to praktyczny produkt fundacji: od pierwszego kontaktu z firmą do ponownego pomiaru po ok. 12 miesiącach. </w:t>
       </w:r>
     </w:p>
@@ -38,7 +88,21 @@
         <w:rPr>
           <w:lang w:val="pl-PL"/>
         </w:rPr>
-        <w:t>Fundacja działa na  dwóch  ścieżkach:</w:t>
+        <w:t xml:space="preserve">Fundacja działa </w:t>
+      </w:r>
+      <w:proofErr w:type="gramStart"/>
+      <w:r>
+        <w:rPr>
+          <w:lang w:val="pl-PL"/>
+        </w:rPr>
+        <w:t>na  dwóch</w:t>
+      </w:r>
+      <w:proofErr w:type="gramEnd"/>
+      <w:r>
+        <w:rPr>
+          <w:lang w:val="pl-PL"/>
+        </w:rPr>
+        <w:t xml:space="preserve">  ścieżkach:</w:t>
       </w:r>
     </w:p>
     <w:tbl>
@@ -64,9 +128,11 @@
             <w:shd w:val="clear" w:color="auto" w:fill="F2F2F2"/>
           </w:tcPr>
           <w:p>
+            <w:proofErr w:type="spellStart"/>
             <w:r>
               <w:t>Ścieżka</w:t>
             </w:r>
+            <w:proofErr w:type="spellEnd"/>
           </w:p>
         </w:tc>
         <w:tc>
@@ -76,8 +142,21 @@
           </w:tcPr>
           <w:p>
             <w:r>
-              <w:t>Co kupuje firma</w:t>
-            </w:r>
+              <w:t xml:space="preserve">Co </w:t>
+            </w:r>
+            <w:proofErr w:type="spellStart"/>
+            <w:r>
+              <w:t>kupuje</w:t>
+            </w:r>
+            <w:proofErr w:type="spellEnd"/>
+            <w:r>
+              <w:t xml:space="preserve"> </w:t>
+            </w:r>
+            <w:proofErr w:type="spellStart"/>
+            <w:r>
+              <w:t>firma</w:t>
+            </w:r>
+            <w:proofErr w:type="spellEnd"/>
           </w:p>
         </w:tc>
         <w:tc>
@@ -86,9 +165,27 @@
             <w:shd w:val="clear" w:color="auto" w:fill="F2F2F2"/>
           </w:tcPr>
           <w:p>
-            <w:r>
-              <w:t>Budżet po stronie firmy</w:t>
-            </w:r>
+            <w:proofErr w:type="spellStart"/>
+            <w:r>
+              <w:t>Budżet</w:t>
+            </w:r>
+            <w:proofErr w:type="spellEnd"/>
+            <w:r>
+              <w:t xml:space="preserve"> po </w:t>
+            </w:r>
+            <w:proofErr w:type="spellStart"/>
+            <w:r>
+              <w:t>stronie</w:t>
+            </w:r>
+            <w:proofErr w:type="spellEnd"/>
+            <w:r>
+              <w:t xml:space="preserve"> </w:t>
+            </w:r>
+            <w:proofErr w:type="spellStart"/>
+            <w:r>
+              <w:t>firmy</w:t>
+            </w:r>
+            <w:proofErr w:type="spellEnd"/>
           </w:p>
         </w:tc>
         <w:tc>
@@ -97,9 +194,35 @@
             <w:shd w:val="clear" w:color="auto" w:fill="F2F2F2"/>
           </w:tcPr>
           <w:p>
-            <w:r>
-              <w:t>Czego firma nie dostaje</w:t>
-            </w:r>
+            <w:proofErr w:type="spellStart"/>
+            <w:r>
+              <w:t>Czego</w:t>
+            </w:r>
+            <w:proofErr w:type="spellEnd"/>
+            <w:r>
+              <w:t xml:space="preserve"> </w:t>
+            </w:r>
+            <w:proofErr w:type="spellStart"/>
+            <w:r>
+              <w:t>firma</w:t>
+            </w:r>
+            <w:proofErr w:type="spellEnd"/>
+            <w:r>
+              <w:t xml:space="preserve"> </w:t>
+            </w:r>
+            <w:proofErr w:type="spellStart"/>
+            <w:r>
+              <w:t>nie</w:t>
+            </w:r>
+            <w:proofErr w:type="spellEnd"/>
+            <w:r>
+              <w:t xml:space="preserve"> </w:t>
+            </w:r>
+            <w:proofErr w:type="spellStart"/>
+            <w:r>
+              <w:t>dostaje</w:t>
+            </w:r>
+            <w:proofErr w:type="spellEnd"/>
           </w:p>
         </w:tc>
       </w:tr>
@@ -113,8 +236,30 @@
               <w:rPr>
                 <w:b/>
               </w:rPr>
-              <w:t>Sponsor kampanii społecznej</w:t>
-            </w:r>
+              <w:t xml:space="preserve">Sponsor </w:t>
+            </w:r>
+            <w:proofErr w:type="spellStart"/>
+            <w:r>
+              <w:rPr>
+                <w:b/>
+              </w:rPr>
+              <w:t>kampanii</w:t>
+            </w:r>
+            <w:proofErr w:type="spellEnd"/>
+            <w:r>
+              <w:rPr>
+                <w:b/>
+              </w:rPr>
+              <w:t xml:space="preserve"> </w:t>
+            </w:r>
+            <w:proofErr w:type="spellStart"/>
+            <w:r>
+              <w:rPr>
+                <w:b/>
+              </w:rPr>
+              <w:t>społecznej</w:t>
+            </w:r>
+            <w:proofErr w:type="spellEnd"/>
           </w:p>
         </w:tc>
         <w:tc>
@@ -122,7 +267,15 @@
             <w:tcW w:w="2340" w:type="dxa"/>
           </w:tcPr>
           <w:p>
-            <w:r>
+            <w:pPr>
+              <w:rPr>
+                <w:lang w:val="pl-PL"/>
+              </w:rPr>
+            </w:pPr>
+            <w:r>
+              <w:rPr>
+                <w:lang w:val="pl-PL"/>
+              </w:rPr>
               <w:t>Widoczność i udział w misji</w:t>
             </w:r>
           </w:p>
@@ -142,7 +295,15 @@
             <w:tcW w:w="2340" w:type="dxa"/>
           </w:tcPr>
           <w:p>
-            <w:r>
+            <w:pPr>
+              <w:rPr>
+                <w:lang w:val="pl-PL"/>
+              </w:rPr>
+            </w:pPr>
+            <w:r>
+              <w:rPr>
+                <w:lang w:val="pl-PL"/>
+              </w:rPr>
               <w:t>Diagnozy ani żadnego znaku „bezpiecznej firmy”</w:t>
             </w:r>
           </w:p>
@@ -154,9 +315,15 @@
             <w:tcW w:w="2340" w:type="dxa"/>
           </w:tcPr>
           <w:p>
+            <w:pPr>
+              <w:rPr>
+                <w:lang w:val="pl-PL"/>
+              </w:rPr>
+            </w:pPr>
             <w:r>
               <w:rPr>
                 <w:b/>
+                <w:lang w:val="pl-PL"/>
               </w:rPr>
               <w:t>„Sprawdź, jak to jest u was”</w:t>
             </w:r>
@@ -167,7 +334,15 @@
             <w:tcW w:w="2340" w:type="dxa"/>
           </w:tcPr>
           <w:p>
-            <w:r>
+            <w:pPr>
+              <w:rPr>
+                <w:lang w:val="pl-PL"/>
+              </w:rPr>
+            </w:pPr>
+            <w:r>
+              <w:rPr>
+                <w:lang w:val="pl-PL"/>
+              </w:rPr>
               <w:t>Diagnozę, działania i ponowny pomiar</w:t>
             </w:r>
           </w:p>
@@ -177,8 +352,21 @@
             <w:tcW w:w="2340" w:type="dxa"/>
           </w:tcPr>
           <w:p>
-            <w:r>
-              <w:t>Zarząd, HR, ryzyko, compliance</w:t>
+            <w:proofErr w:type="spellStart"/>
+            <w:r>
+              <w:t>Zarząd</w:t>
+            </w:r>
+            <w:proofErr w:type="spellEnd"/>
+            <w:r>
+              <w:t xml:space="preserve">, HR, </w:t>
+            </w:r>
+            <w:proofErr w:type="spellStart"/>
+            <w:r>
+              <w:t>ryzyko</w:t>
+            </w:r>
+            <w:proofErr w:type="spellEnd"/>
+            <w:r>
+              <w:t>, compliance</w:t>
             </w:r>
           </w:p>
         </w:tc>
@@ -187,7 +375,15 @@
             <w:tcW w:w="2340" w:type="dxa"/>
           </w:tcPr>
           <w:p>
-            <w:r>
+            <w:pPr>
+              <w:rPr>
+                <w:lang w:val="pl-PL"/>
+              </w:rPr>
+            </w:pPr>
+            <w:r>
+              <w:rPr>
+                <w:lang w:val="pl-PL"/>
+              </w:rPr>
               <w:t>Widoczności w pakiecie (może dokupić ścieżkę sponsorską)</w:t>
             </w:r>
           </w:p>
@@ -195,11 +391,47 @@
       </w:tr>
     </w:tbl>
     <w:p>
+      <w:proofErr w:type="spellStart"/>
       <w:r>
         <w:rPr>
           <w:b/>
         </w:rPr>
-        <w:t>Skąd przychodzą firmy:</w:t>
+        <w:t>Skąd</w:t>
+      </w:r>
+      <w:proofErr w:type="spellEnd"/>
+      <w:r>
+        <w:rPr>
+          <w:b/>
+        </w:rPr>
+        <w:t xml:space="preserve"> </w:t>
+      </w:r>
+      <w:proofErr w:type="spellStart"/>
+      <w:r>
+        <w:rPr>
+          <w:b/>
+        </w:rPr>
+        <w:t>przychodzą</w:t>
+      </w:r>
+      <w:proofErr w:type="spellEnd"/>
+      <w:r>
+        <w:rPr>
+          <w:b/>
+        </w:rPr>
+        <w:t xml:space="preserve"> </w:t>
+      </w:r>
+      <w:proofErr w:type="spellStart"/>
+      <w:r>
+        <w:rPr>
+          <w:b/>
+        </w:rPr>
+        <w:t>firmy</w:t>
+      </w:r>
+      <w:proofErr w:type="spellEnd"/>
+      <w:r>
+        <w:rPr>
+          <w:b/>
+        </w:rPr>
+        <w:t>:</w:t>
       </w:r>
     </w:p>
     <w:p>
@@ -209,8 +441,14 @@
           <w:ilvl w:val="0"/>
           <w:numId w:val="2"/>
         </w:numPr>
-      </w:pPr>
-      <w:r>
+        <w:rPr>
+          <w:lang w:val="pl-PL"/>
+        </w:rPr>
+      </w:pPr>
+      <w:r>
+        <w:rPr>
+          <w:lang w:val="pl-PL"/>
+        </w:rPr>
         <w:t>listy adresowe i kontakty z konferencji (partnerzy, goście, prelegenci);</w:t>
       </w:r>
     </w:p>
@@ -221,8 +459,14 @@
           <w:ilvl w:val="0"/>
           <w:numId w:val="2"/>
         </w:numPr>
-      </w:pPr>
-      <w:r>
+        <w:rPr>
+          <w:lang w:val="pl-PL"/>
+        </w:rPr>
+      </w:pPr>
+      <w:r>
+        <w:rPr>
+          <w:lang w:val="pl-PL"/>
+        </w:rPr>
         <w:t>zapytania od uczestników transmisji online;</w:t>
       </w:r>
     </w:p>
@@ -233,8 +477,14 @@
           <w:ilvl w:val="0"/>
           <w:numId w:val="2"/>
         </w:numPr>
-      </w:pPr>
-      <w:r>
+        <w:rPr>
+          <w:lang w:val="pl-PL"/>
+        </w:rPr>
+      </w:pPr>
+      <w:r>
+        <w:rPr>
+          <w:lang w:val="pl-PL"/>
+        </w:rPr>
         <w:t>sponsorzy kampanii, którzy chcą przejść od wizerunku do działania;</w:t>
       </w:r>
     </w:p>
@@ -245,26 +495,270 @@
           <w:ilvl w:val="0"/>
           <w:numId w:val="2"/>
         </w:numPr>
-      </w:pPr>
-      <w:r>
+        <w:rPr>
+          <w:lang w:val="pl-PL"/>
+        </w:rPr>
+      </w:pPr>
+      <w:r>
+        <w:rPr>
+          <w:lang w:val="pl-PL"/>
+        </w:rPr>
         <w:t>odbiorcy raportów „Ile kosztuje milczenie?” i „Wychowani do milczenia” oraz publikacji w mediach.</w:t>
       </w:r>
     </w:p>
     <w:p>
-      <w:r>
+      <w:pPr>
+        <w:rPr>
+          <w:lang w:val="pl-PL"/>
+        </w:rPr>
+      </w:pPr>
+      <w:r>
+        <w:rPr>
+          <w:lang w:val="pl-PL"/>
+        </w:rPr>
         <w:t>Konferencja nie jest sprzedawana (jedynie dobrowolna cegiełka). Jej rolą jest zbudowanie wiarygodności i kontaktów, z których rodzą się zapytania wchodzące w krok 0.</w:t>
       </w:r>
     </w:p>
     <w:p>
       <w:pPr>
         <w:pStyle w:val="Nagwek2"/>
-      </w:pPr>
-      <w:r>
+        <w:rPr>
+          <w:color w:val="000000"/>
+          <w:sz w:val="28"/>
+          <w:szCs w:val="28"/>
+          <w:lang w:val="pl-PL"/>
+        </w:rPr>
+      </w:pPr>
+      <w:r>
+        <w:rPr>
+          <w:color w:val="000000"/>
+          <w:sz w:val="28"/>
+          <w:szCs w:val="28"/>
+          <w:lang w:val="pl-PL"/>
+        </w:rPr>
+        <w:t>Ustalenia Pawła z 5 października 2026</w:t>
+      </w:r>
+    </w:p>
+    <w:p>
+      <w:pPr>
+        <w:pStyle w:val="NormalnyWeb"/>
+        <w:rPr>
+          <w:rFonts w:ascii="Calibri" w:hAnsi="Calibri" w:cs="Calibri"/>
+          <w:color w:val="000000"/>
+          <w:sz w:val="22"/>
+          <w:szCs w:val="22"/>
+        </w:rPr>
+      </w:pPr>
+      <w:r>
+        <w:rPr>
+          <w:rFonts w:ascii="Calibri" w:hAnsi="Calibri" w:cs="Calibri"/>
+          <w:b/>
+          <w:bCs/>
+          <w:color w:val="000000"/>
+          <w:sz w:val="22"/>
+          <w:szCs w:val="22"/>
+        </w:rPr>
+        <w:t>Dwa profile edukacji.</w:t>
+      </w:r>
+      <w:r>
+        <w:rPr>
+          <w:rFonts w:ascii="Calibri" w:hAnsi="Calibri" w:cs="Calibri"/>
+          <w:color w:val="000000"/>
+          <w:sz w:val="22"/>
+          <w:szCs w:val="22"/>
+        </w:rPr>
+        <w:t xml:space="preserve"> Profil biznesowy dla zarządu ma dotyczyć odpowiedzialności za warunki zgłaszania problemów, reakcji na sygnały i decyzji o profilaktyce. Profil współpracy dla pracowników ma dotyczyć rozmowy o trudnościach, korzystania z procedur i współpracy w codziennej pracy. Zakres, prowadzący i terminy: [DO UZUPEŁNIENIA].</w:t>
+      </w:r>
+    </w:p>
+    <w:p>
+      <w:pPr>
+        <w:pStyle w:val="NormalnyWeb"/>
+        <w:rPr>
+          <w:rFonts w:ascii="Calibri" w:hAnsi="Calibri" w:cs="Calibri"/>
+          <w:color w:val="000000"/>
+          <w:sz w:val="22"/>
+          <w:szCs w:val="22"/>
+        </w:rPr>
+      </w:pPr>
+      <w:r>
+        <w:rPr>
+          <w:rFonts w:ascii="Calibri" w:hAnsi="Calibri" w:cs="Calibri"/>
+          <w:b/>
+          <w:bCs/>
+          <w:color w:val="000000"/>
+          <w:sz w:val="22"/>
+          <w:szCs w:val="22"/>
+        </w:rPr>
+        <w:t>Trzy filtry systemowe.</w:t>
+      </w:r>
+      <w:r>
+        <w:rPr>
+          <w:rFonts w:ascii="Calibri" w:hAnsi="Calibri" w:cs="Calibri"/>
+          <w:color w:val="000000"/>
+          <w:sz w:val="22"/>
+          <w:szCs w:val="22"/>
+        </w:rPr>
+        <w:t xml:space="preserve"> Proponuję osobno sprawdzać: zrozumiałość regulaminu („rozumiem, co mam zrobić”), zaufanie do jego działania („wierzę, że zgłoszenie zostanie potraktowane poważnie”) oraz gotowość do własnego zastosowania („korzystam, bo to działa i nie obawiam się konsekwencji”). To roboczy schemat diagnozy, do opracowania z psychometrą.</w:t>
+      </w:r>
+    </w:p>
+    <w:p>
+      <w:pPr>
+        <w:pStyle w:val="NormalnyWeb"/>
+        <w:rPr>
+          <w:rFonts w:ascii="Calibri" w:hAnsi="Calibri" w:cs="Calibri"/>
+          <w:color w:val="000000"/>
+          <w:sz w:val="22"/>
+          <w:szCs w:val="22"/>
+        </w:rPr>
+      </w:pPr>
+      <w:r>
+        <w:rPr>
+          <w:rFonts w:ascii="Calibri" w:hAnsi="Calibri" w:cs="Calibri"/>
+          <w:b/>
+          <w:bCs/>
+          <w:color w:val="000000"/>
+          <w:sz w:val="22"/>
+          <w:szCs w:val="22"/>
+        </w:rPr>
+        <w:t>Komunikacja na LinkedIn.</w:t>
+      </w:r>
+      <w:r>
+        <w:rPr>
+          <w:rFonts w:ascii="Calibri" w:hAnsi="Calibri" w:cs="Calibri"/>
+          <w:color w:val="000000"/>
+          <w:sz w:val="22"/>
+          <w:szCs w:val="22"/>
+        </w:rPr>
+        <w:t xml:space="preserve"> Temat do przygotowania: związek rzeczywistej profilaktyki u pracodawców z bezpieczeństwem psychologicznym i korzystaniem z procedur. Zmiana prawna wskazana roboczo jako </w:t>
+      </w:r>
+      <w:r>
+        <w:rPr>
+          <w:rFonts w:ascii="Calibri" w:hAnsi="Calibri" w:cs="Calibri"/>
+          <w:color w:val="000000"/>
+          <w:sz w:val="22"/>
+          <w:szCs w:val="22"/>
+        </w:rPr>
         <w:lastRenderedPageBreak/>
+        <w:t>„5.11”: [AKT, ROK, PRZEPIS I LINK DO UZUPEŁNIENIA]. Do ustalenia także, czy chodzi o datę projektu, uchwalenia czy wejścia w życie. Wątek prawny pozostaje do weryfikacji przed publikacją.</w:t>
+      </w:r>
+    </w:p>
+    <w:p>
+      <w:pPr>
+        <w:pStyle w:val="NormalnyWeb"/>
+        <w:rPr>
+          <w:rFonts w:ascii="Calibri" w:hAnsi="Calibri" w:cs="Calibri"/>
+          <w:color w:val="000000"/>
+          <w:sz w:val="22"/>
+          <w:szCs w:val="22"/>
+        </w:rPr>
+      </w:pPr>
+      <w:r>
+        <w:rPr>
+          <w:rFonts w:ascii="Calibri" w:hAnsi="Calibri" w:cs="Calibri"/>
+          <w:b/>
+          <w:bCs/>
+          <w:color w:val="000000"/>
+          <w:sz w:val="22"/>
+          <w:szCs w:val="22"/>
+        </w:rPr>
+        <w:t>Dostępność języka regulaminów.</w:t>
+      </w:r>
+      <w:r>
+        <w:rPr>
+          <w:rFonts w:ascii="Calibri" w:hAnsi="Calibri" w:cs="Calibri"/>
+          <w:color w:val="000000"/>
+          <w:sz w:val="22"/>
+          <w:szCs w:val="22"/>
+        </w:rPr>
+        <w:t xml:space="preserve"> W sprawdzaniu zrozumiałości uwzględniamy różne potrzeby odbiorców, w tym osób </w:t>
+      </w:r>
+      <w:proofErr w:type="spellStart"/>
+      <w:r>
+        <w:rPr>
+          <w:rFonts w:ascii="Calibri" w:hAnsi="Calibri" w:cs="Calibri"/>
+          <w:color w:val="000000"/>
+          <w:sz w:val="22"/>
+          <w:szCs w:val="22"/>
+        </w:rPr>
+        <w:t>neuroróżnorodnych</w:t>
+      </w:r>
+      <w:proofErr w:type="spellEnd"/>
+      <w:r>
+        <w:rPr>
+          <w:rFonts w:ascii="Calibri" w:hAnsi="Calibri" w:cs="Calibri"/>
+          <w:color w:val="000000"/>
+          <w:sz w:val="22"/>
+          <w:szCs w:val="22"/>
+        </w:rPr>
+        <w:t xml:space="preserve">. Badanie wskazane przez Pawła: [AUTOR, TYTUŁ, ROK I LINK DO UZUPEŁNIENIA]. Do czasu odczytania badania nie przypisujemy mu konkretnego wyniku ani nie uogólniamy trudności na wszystkie osoby </w:t>
+      </w:r>
+      <w:proofErr w:type="spellStart"/>
+      <w:r>
+        <w:rPr>
+          <w:rFonts w:ascii="Calibri" w:hAnsi="Calibri" w:cs="Calibri"/>
+          <w:color w:val="000000"/>
+          <w:sz w:val="22"/>
+          <w:szCs w:val="22"/>
+        </w:rPr>
+        <w:t>neuroróżnorodne</w:t>
+      </w:r>
+      <w:proofErr w:type="spellEnd"/>
+      <w:r>
+        <w:rPr>
+          <w:rFonts w:ascii="Calibri" w:hAnsi="Calibri" w:cs="Calibri"/>
+          <w:color w:val="000000"/>
+          <w:sz w:val="22"/>
+          <w:szCs w:val="22"/>
+        </w:rPr>
+        <w:t>.</w:t>
+      </w:r>
+    </w:p>
+    <w:p>
+      <w:pPr>
+        <w:pStyle w:val="Nagwek2"/>
+        <w:rPr>
+          <w:lang w:val="pl-PL"/>
+        </w:rPr>
+      </w:pPr>
+      <w:r>
+        <w:rPr>
+          <w:lang w:val="pl-PL"/>
+        </w:rPr>
         <w:t>Mapa ścieżki</w:t>
       </w:r>
       <w:r>
-        <w:t xml:space="preserve">- na razie jako 2 etapy ( bo próg wejścia) ale możemy jako 1 umowa total </w:t>
+        <w:rPr>
+          <w:lang w:val="pl-PL"/>
+        </w:rPr>
+        <w:t xml:space="preserve">- na razie jako 2 etapy </w:t>
+      </w:r>
+      <w:proofErr w:type="gramStart"/>
+      <w:r>
+        <w:rPr>
+          <w:lang w:val="pl-PL"/>
+        </w:rPr>
+        <w:t>( bo</w:t>
+      </w:r>
+      <w:proofErr w:type="gramEnd"/>
+      <w:r>
+        <w:rPr>
+          <w:lang w:val="pl-PL"/>
+        </w:rPr>
+        <w:t xml:space="preserve"> próg wejścia) ale możemy jako 1 umowa </w:t>
+      </w:r>
+      <w:proofErr w:type="spellStart"/>
+      <w:r>
+        <w:rPr>
+          <w:lang w:val="pl-PL"/>
+        </w:rPr>
+        <w:t>total</w:t>
+      </w:r>
+      <w:proofErr w:type="spellEnd"/>
+      <w:r>
+        <w:rPr>
+          <w:lang w:val="pl-PL"/>
+        </w:rPr>
+        <w:t xml:space="preserve"> </w:t>
       </w:r>
     </w:p>
     <w:p>
@@ -308,44 +802,89 @@
       </w:r>
     </w:p>
     <w:p>
-      <w:r>
+      <w:pPr>
+        <w:rPr>
+          <w:lang w:val="pl-PL"/>
+        </w:rPr>
+      </w:pPr>
+      <w:r>
+        <w:rPr>
+          <w:lang w:val="pl-PL"/>
+        </w:rPr>
         <w:t>ścieżka wejścia · 11 kroków, 2 decyzje klienta</w:t>
       </w:r>
     </w:p>
     <w:p>
-      <w:r>
+      <w:pPr>
+        <w:rPr>
+          <w:lang w:val="pl-PL"/>
+        </w:rPr>
+      </w:pPr>
+      <w:r>
+        <w:rPr>
+          <w:lang w:val="pl-PL"/>
+        </w:rPr>
         <w:t>Pierwsza decyzja klienta dotyczy samej diagnozy; druga, podjęta po wynikach, obejmuje działania, monitoring i ponowny pomiar.</w:t>
       </w:r>
     </w:p>
     <w:p>
       <w:pPr>
         <w:pStyle w:val="Nagwek2"/>
-      </w:pPr>
-      <w:r>
+        <w:rPr>
+          <w:lang w:val="pl-PL"/>
+        </w:rPr>
+      </w:pPr>
+      <w:r>
+        <w:rPr>
+          <w:lang w:val="pl-PL"/>
+        </w:rPr>
         <w:t>Opis kroków</w:t>
       </w:r>
     </w:p>
     <w:p>
-      <w:r>
+      <w:pPr>
+        <w:rPr>
+          <w:lang w:val="pl-PL"/>
+        </w:rPr>
+      </w:pPr>
+      <w:r>
+        <w:rPr>
+          <w:lang w:val="pl-PL"/>
+        </w:rPr>
         <w:t>Czasy trwania są propozycją do weryfikacji. Kroki 3–5 (ankieta, Kalkulator, diagnoza) opisane są tu tylko organizacyjnie; ich treść to osobny etap prac.</w:t>
       </w:r>
     </w:p>
     <w:p>
       <w:pPr>
         <w:pStyle w:val="Nagwek3"/>
-      </w:pPr>
-      <w:r>
+        <w:rPr>
+          <w:lang w:val="pl-PL"/>
+        </w:rPr>
+      </w:pPr>
+      <w:r>
+        <w:rPr>
+          <w:lang w:val="pl-PL"/>
+        </w:rPr>
         <w:t>Krok 0. Kwalifikacja zapytania</w:t>
       </w:r>
     </w:p>
     <w:p>
+      <w:pPr>
+        <w:rPr>
+          <w:lang w:val="pl-PL"/>
+        </w:rPr>
+      </w:pPr>
       <w:r>
         <w:rPr>
           <w:b/>
+          <w:lang w:val="pl-PL"/>
         </w:rPr>
         <w:t>Cel:</w:t>
       </w:r>
       <w:r>
+        <w:rPr>
+          <w:lang w:val="pl-PL"/>
+        </w:rPr>
         <w:t xml:space="preserve"> czas zarządu fundacji idzie tylko do firm, które mogą i powinny kupić.</w:t>
       </w:r>
     </w:p>
@@ -356,8 +895,14 @@
           <w:ilvl w:val="0"/>
           <w:numId w:val="3"/>
         </w:numPr>
-      </w:pPr>
-      <w:r>
+        <w:rPr>
+          <w:lang w:val="pl-PL"/>
+        </w:rPr>
+      </w:pPr>
+      <w:r>
+        <w:rPr>
+          <w:lang w:val="pl-PL"/>
+        </w:rPr>
         <w:t>Krótka rozmowa (20–30 min) lub formularz.</w:t>
       </w:r>
     </w:p>
@@ -368,8 +913,14 @@
           <w:ilvl w:val="0"/>
           <w:numId w:val="3"/>
         </w:numPr>
-      </w:pPr>
-      <w:r>
+        <w:rPr>
+          <w:lang w:val="pl-PL"/>
+        </w:rPr>
+      </w:pPr>
+      <w:r>
+        <w:rPr>
+          <w:lang w:val="pl-PL"/>
+        </w:rPr>
         <w:t>Dane: wielkość, liczba zespołów i lokalizacji, branża.</w:t>
       </w:r>
     </w:p>
@@ -380,8 +931,14 @@
           <w:ilvl w:val="0"/>
           <w:numId w:val="3"/>
         </w:numPr>
-      </w:pPr>
-      <w:r>
+        <w:rPr>
+          <w:lang w:val="pl-PL"/>
+        </w:rPr>
+      </w:pPr>
+      <w:r>
+        <w:rPr>
+          <w:lang w:val="pl-PL"/>
+        </w:rPr>
         <w:t>Kto zgłasza i kto w zarządzie byłby właścicielem projektu.</w:t>
       </w:r>
     </w:p>
@@ -392,8 +949,14 @@
           <w:ilvl w:val="0"/>
           <w:numId w:val="3"/>
         </w:numPr>
-      </w:pPr>
-      <w:r>
+        <w:rPr>
+          <w:lang w:val="pl-PL"/>
+        </w:rPr>
+      </w:pPr>
+      <w:r>
+        <w:rPr>
+          <w:lang w:val="pl-PL"/>
+        </w:rPr>
         <w:t>Powód „dlaczego teraz”: rotacja, zmiana, regulacje, incydent, ESG.</w:t>
       </w:r>
     </w:p>
@@ -404,8 +967,14 @@
           <w:ilvl w:val="0"/>
           <w:numId w:val="3"/>
         </w:numPr>
-      </w:pPr>
-      <w:r>
+        <w:rPr>
+          <w:lang w:val="pl-PL"/>
+        </w:rPr>
+      </w:pPr>
+      <w:r>
+        <w:rPr>
+          <w:lang w:val="pl-PL"/>
+        </w:rPr>
         <w:t>Jakie dane HR firma ma (wstępnie).</w:t>
       </w:r>
     </w:p>
@@ -416,59 +985,102 @@
           <w:ilvl w:val="0"/>
           <w:numId w:val="3"/>
         </w:numPr>
-      </w:pPr>
-      <w:r>
+        <w:rPr>
+          <w:lang w:val="pl-PL"/>
+        </w:rPr>
+      </w:pPr>
+      <w:r>
+        <w:rPr>
+          <w:lang w:val="pl-PL"/>
+        </w:rPr>
+        <w:lastRenderedPageBreak/>
         <w:t>Filtr etyczny: program nie może przykrywać bieżącego kryzysu.</w:t>
       </w:r>
     </w:p>
     <w:p>
+      <w:pPr>
+        <w:rPr>
+          <w:lang w:val="pl-PL"/>
+        </w:rPr>
+      </w:pPr>
       <w:r>
         <w:rPr>
           <w:b/>
+          <w:lang w:val="pl-PL"/>
         </w:rPr>
         <w:t>Rezultat:</w:t>
       </w:r>
       <w:r>
+        <w:rPr>
+          <w:lang w:val="pl-PL"/>
+        </w:rPr>
         <w:t xml:space="preserve"> umawiamy zarząd albo kierujemy do ścieżki sponsorskiej lub materiałów.</w:t>
       </w:r>
     </w:p>
     <w:p>
+      <w:pPr>
+        <w:rPr>
+          <w:lang w:val="pl-PL"/>
+        </w:rPr>
+      </w:pPr>
       <w:r>
         <w:rPr>
           <w:b/>
+          <w:lang w:val="pl-PL"/>
         </w:rPr>
         <w:t>Plus:</w:t>
       </w:r>
       <w:r>
+        <w:rPr>
+          <w:lang w:val="pl-PL"/>
+        </w:rPr>
         <w:t xml:space="preserve"> chroni czas zespołu. </w:t>
       </w:r>
       <w:r>
         <w:rPr>
           <w:b/>
+          <w:lang w:val="pl-PL"/>
         </w:rPr>
         <w:t>Minus:</w:t>
       </w:r>
       <w:r>
+        <w:rPr>
+          <w:lang w:val="pl-PL"/>
+        </w:rPr>
         <w:t xml:space="preserve"> zbyt sztywny filtr może odstraszyć firmy, które dopiero dojrzewają do tematu.</w:t>
       </w:r>
     </w:p>
     <w:p>
       <w:pPr>
         <w:pStyle w:val="Nagwek3"/>
-      </w:pPr>
-      <w:r>
-        <w:lastRenderedPageBreak/>
+        <w:rPr>
+          <w:lang w:val="pl-PL"/>
+        </w:rPr>
+      </w:pPr>
+      <w:r>
+        <w:rPr>
+          <w:lang w:val="pl-PL"/>
+        </w:rPr>
         <w:t>Krok 1. Spotkanie z zarządem (ok. 90 min)</w:t>
       </w:r>
     </w:p>
     <w:p>
+      <w:pPr>
+        <w:rPr>
+          <w:lang w:val="pl-PL"/>
+        </w:rPr>
+      </w:pPr>
       <w:r>
         <w:rPr>
           <w:b/>
+          <w:lang w:val="pl-PL"/>
         </w:rPr>
         <w:t>Cel:</w:t>
       </w:r>
       <w:r>
+        <w:rPr>
+          <w:lang w:val="pl-PL"/>
+        </w:rPr>
         <w:t xml:space="preserve"> zarząd rozumie BP i BS i chce sprawdzić, jak jest u nich.</w:t>
       </w:r>
     </w:p>
@@ -479,8 +1091,14 @@
           <w:ilvl w:val="0"/>
           <w:numId w:val="4"/>
         </w:numPr>
-      </w:pPr>
-      <w:r>
+        <w:rPr>
+          <w:lang w:val="pl-PL"/>
+        </w:rPr>
+      </w:pPr>
+      <w:r>
+        <w:rPr>
+          <w:lang w:val="pl-PL"/>
+        </w:rPr>
         <w:t>System wczesnego ostrzegania: BP to „ludzie mówią”, BS to „organizacja słyszy i reaguje”.</w:t>
       </w:r>
     </w:p>
@@ -491,8 +1109,14 @@
           <w:ilvl w:val="0"/>
           <w:numId w:val="4"/>
         </w:numPr>
-      </w:pPr>
-      <w:r>
+        <w:rPr>
+          <w:lang w:val="pl-PL"/>
+        </w:rPr>
+      </w:pPr>
+      <w:r>
+        <w:rPr>
+          <w:lang w:val="pl-PL"/>
+        </w:rPr>
         <w:t>Korelacje z raportu Ipsos (BP a zaangażowanie, innowacyjność, wiara w procedury) pokazane jako pytanie: „tak jest w Polsce, a u was?”.</w:t>
       </w:r>
     </w:p>
@@ -503,8 +1127,14 @@
           <w:ilvl w:val="0"/>
           <w:numId w:val="4"/>
         </w:numPr>
-      </w:pPr>
-      <w:r>
+        <w:rPr>
+          <w:lang w:val="pl-PL"/>
+        </w:rPr>
+      </w:pPr>
+      <w:r>
+        <w:rPr>
+          <w:lang w:val="pl-PL"/>
+        </w:rPr>
         <w:t>Polska specyfika: folwark, „donosicielstwo”, „nie wychylaj się”.</w:t>
       </w:r>
     </w:p>
@@ -515,8 +1145,14 @@
           <w:ilvl w:val="0"/>
           <w:numId w:val="4"/>
         </w:numPr>
-      </w:pPr>
-      <w:r>
+        <w:rPr>
+          <w:lang w:val="pl-PL"/>
+        </w:rPr>
+      </w:pPr>
+      <w:r>
+        <w:rPr>
+          <w:lang w:val="pl-PL"/>
+        </w:rPr>
         <w:t>Powiązanie z ryzykiem i regulacjami: sygnaliści, jawność płac, raportowanie ESG.</w:t>
       </w:r>
     </w:p>
@@ -527,8 +1163,14 @@
           <w:ilvl w:val="0"/>
           <w:numId w:val="4"/>
         </w:numPr>
-      </w:pPr>
-      <w:r>
+        <w:rPr>
+          <w:lang w:val="pl-PL"/>
+        </w:rPr>
+      </w:pPr>
+      <w:r>
+        <w:rPr>
+          <w:lang w:val="pl-PL"/>
+        </w:rPr>
         <w:t>Krótkie ćwiczenie: czego zarząd nie wie o tym, co ludzie przemilczają.</w:t>
       </w:r>
     </w:p>
@@ -539,69 +1181,121 @@
           <w:ilvl w:val="0"/>
           <w:numId w:val="4"/>
         </w:numPr>
-      </w:pPr>
-      <w:r>
+        <w:rPr>
+          <w:lang w:val="pl-PL"/>
+        </w:rPr>
+      </w:pPr>
+      <w:r>
+        <w:rPr>
+          <w:lang w:val="pl-PL"/>
+        </w:rPr>
         <w:t>Opis ścieżki, wymagania wobec zarządu, uczciwe zastrzeżenia (wynik może być trudny, wskaźniki HR reagują z opóźnieniem).</w:t>
       </w:r>
     </w:p>
     <w:p>
+      <w:pPr>
+        <w:rPr>
+          <w:lang w:val="pl-PL"/>
+        </w:rPr>
+      </w:pPr>
       <w:r>
         <w:rPr>
           <w:b/>
+          <w:lang w:val="pl-PL"/>
         </w:rPr>
         <w:t>Firma dostaje:</w:t>
       </w:r>
       <w:r>
+        <w:rPr>
+          <w:lang w:val="pl-PL"/>
+        </w:rPr>
         <w:t xml:space="preserve"> prezentację dla zarządu i jednostronicowy opis ścieżki.</w:t>
       </w:r>
     </w:p>
     <w:p>
+      <w:pPr>
+        <w:rPr>
+          <w:lang w:val="pl-PL"/>
+        </w:rPr>
+      </w:pPr>
       <w:r>
         <w:rPr>
           <w:b/>
+          <w:lang w:val="pl-PL"/>
         </w:rPr>
         <w:t>Rezultat:</w:t>
       </w:r>
       <w:r>
+        <w:rPr>
+          <w:lang w:val="pl-PL"/>
+        </w:rPr>
         <w:t xml:space="preserve"> propozycja z ceną wysłana w ciągu kilku dni albo decyzja na miejscu.</w:t>
       </w:r>
     </w:p>
     <w:p>
+      <w:pPr>
+        <w:rPr>
+          <w:lang w:val="pl-PL"/>
+        </w:rPr>
+      </w:pPr>
       <w:r>
         <w:rPr>
           <w:b/>
+          <w:lang w:val="pl-PL"/>
         </w:rPr>
         <w:t>Plus:</w:t>
       </w:r>
       <w:r>
+        <w:rPr>
+          <w:lang w:val="pl-PL"/>
+        </w:rPr>
         <w:t xml:space="preserve"> rozmowa od razu na poziomie zarządu, nie HR. </w:t>
       </w:r>
       <w:r>
         <w:rPr>
           <w:b/>
+          <w:lang w:val="pl-PL"/>
         </w:rPr>
         <w:t>Minus:</w:t>
       </w:r>
       <w:r>
+        <w:rPr>
+          <w:lang w:val="pl-PL"/>
+        </w:rPr>
         <w:t xml:space="preserve"> spotkanie jest kosztem sprzedaży, który trzeba ograniczać kwalifikacją.</w:t>
       </w:r>
     </w:p>
     <w:p>
       <w:pPr>
         <w:pStyle w:val="Nagwek3"/>
-      </w:pPr>
-      <w:r>
+        <w:rPr>
+          <w:lang w:val="pl-PL"/>
+        </w:rPr>
+      </w:pPr>
+      <w:r>
+        <w:rPr>
+          <w:lang w:val="pl-PL"/>
+        </w:rPr>
         <w:t>Krok 2. Umowa – etap 1 i start projektu</w:t>
       </w:r>
     </w:p>
     <w:p>
+      <w:pPr>
+        <w:rPr>
+          <w:lang w:val="pl-PL"/>
+        </w:rPr>
+      </w:pPr>
       <w:r>
         <w:rPr>
           <w:b/>
+          <w:lang w:val="pl-PL"/>
         </w:rPr>
         <w:t>Cel:</w:t>
       </w:r>
       <w:r>
+        <w:rPr>
+          <w:lang w:val="pl-PL"/>
+        </w:rPr>
         <w:t xml:space="preserve"> ustalić zasady, zanim pojawią się wyniki.</w:t>
       </w:r>
     </w:p>
@@ -612,8 +1306,14 @@
           <w:ilvl w:val="0"/>
           <w:numId w:val="5"/>
         </w:numPr>
-      </w:pPr>
-      <w:r>
+        <w:rPr>
+          <w:lang w:val="pl-PL"/>
+        </w:rPr>
+      </w:pPr>
+      <w:r>
+        <w:rPr>
+          <w:lang w:val="pl-PL"/>
+        </w:rPr>
         <w:t>Zakres (zespoły objęte badaniem) i harmonogram.</w:t>
       </w:r>
     </w:p>
@@ -624,8 +1324,14 @@
           <w:ilvl w:val="0"/>
           <w:numId w:val="5"/>
         </w:numPr>
-      </w:pPr>
-      <w:r>
+        <w:rPr>
+          <w:lang w:val="pl-PL"/>
+        </w:rPr>
+      </w:pPr>
+      <w:r>
+        <w:rPr>
+          <w:lang w:val="pl-PL"/>
+        </w:rPr>
         <w:t>Właściciel projektu w zarządzie i osoba operacyjna (zwykle HR).</w:t>
       </w:r>
     </w:p>
@@ -636,8 +1342,14 @@
           <w:ilvl w:val="0"/>
           <w:numId w:val="5"/>
         </w:numPr>
-      </w:pPr>
-      <w:r>
+        <w:rPr>
+          <w:lang w:val="pl-PL"/>
+        </w:rPr>
+      </w:pPr>
+      <w:r>
+        <w:rPr>
+          <w:lang w:val="pl-PL"/>
+        </w:rPr>
         <w:t>Zasady użycia wyników: tylko poziom zespołów z progiem anonimowości; w pierwszym cyklu bez wpływu na oceny menedżerów; wyniki wracają do pracowników.</w:t>
       </w:r>
     </w:p>
@@ -648,8 +1360,14 @@
           <w:ilvl w:val="0"/>
           <w:numId w:val="5"/>
         </w:numPr>
-      </w:pPr>
-      <w:r>
+        <w:rPr>
+          <w:lang w:val="pl-PL"/>
+        </w:rPr>
+      </w:pPr>
+      <w:r>
+        <w:rPr>
+          <w:lang w:val="pl-PL"/>
+        </w:rPr>
         <w:t>Umowa powierzenia danych i minimalny zestaw danych wewnętrznych.</w:t>
       </w:r>
     </w:p>
@@ -661,8 +1379,29 @@
           <w:numId w:val="5"/>
         </w:numPr>
       </w:pPr>
-      <w:r>
-        <w:t>Udział zarządu w programie.</w:t>
+      <w:proofErr w:type="spellStart"/>
+      <w:r>
+        <w:t>Udział</w:t>
+      </w:r>
+      <w:proofErr w:type="spellEnd"/>
+      <w:r>
+        <w:t xml:space="preserve"> </w:t>
+      </w:r>
+      <w:proofErr w:type="spellStart"/>
+      <w:r>
+        <w:t>zarządu</w:t>
+      </w:r>
+      <w:proofErr w:type="spellEnd"/>
+      <w:r>
+        <w:t xml:space="preserve"> w </w:t>
+      </w:r>
+      <w:proofErr w:type="spellStart"/>
+      <w:r>
+        <w:t>programie</w:t>
+      </w:r>
+      <w:proofErr w:type="spellEnd"/>
+      <w:r>
+        <w:t>.</w:t>
       </w:r>
     </w:p>
     <w:p>
@@ -672,69 +1411,121 @@
           <w:ilvl w:val="0"/>
           <w:numId w:val="5"/>
         </w:numPr>
-      </w:pPr>
-      <w:r>
+        <w:rPr>
+          <w:lang w:val="pl-PL"/>
+        </w:rPr>
+      </w:pPr>
+      <w:r>
+        <w:rPr>
+          <w:lang w:val="pl-PL"/>
+        </w:rPr>
         <w:t>Komunikacja do organizacji; informacja dla związków lub rady pracowników, jeśli istnieją.</w:t>
       </w:r>
     </w:p>
     <w:p>
+      <w:pPr>
+        <w:rPr>
+          <w:lang w:val="pl-PL"/>
+        </w:rPr>
+      </w:pPr>
       <w:r>
         <w:rPr>
           <w:b/>
+          <w:lang w:val="pl-PL"/>
         </w:rPr>
         <w:t>Firma dostaje:</w:t>
       </w:r>
       <w:r>
+        <w:rPr>
+          <w:lang w:val="pl-PL"/>
+        </w:rPr>
         <w:t xml:space="preserve"> umowę, kartę projektu (1–2 strony), szablon komunikatu do pracowników.</w:t>
       </w:r>
     </w:p>
     <w:p>
+      <w:pPr>
+        <w:rPr>
+          <w:lang w:val="pl-PL"/>
+        </w:rPr>
+      </w:pPr>
       <w:r>
         <w:rPr>
           <w:b/>
+          <w:lang w:val="pl-PL"/>
         </w:rPr>
         <w:t>Rezultat:</w:t>
       </w:r>
       <w:r>
+        <w:rPr>
+          <w:lang w:val="pl-PL"/>
+        </w:rPr>
         <w:t xml:space="preserve"> podpisany etap 1 (diagnoza), wyznaczone osoby, termin badania.</w:t>
       </w:r>
     </w:p>
     <w:p>
+      <w:pPr>
+        <w:rPr>
+          <w:lang w:val="pl-PL"/>
+        </w:rPr>
+      </w:pPr>
       <w:r>
         <w:rPr>
           <w:b/>
+          <w:lang w:val="pl-PL"/>
         </w:rPr>
         <w:t>Plus:</w:t>
       </w:r>
       <w:r>
+        <w:rPr>
+          <w:lang w:val="pl-PL"/>
+        </w:rPr>
         <w:t xml:space="preserve"> niższy próg wejścia niż umowa roczna. </w:t>
       </w:r>
       <w:r>
         <w:rPr>
           <w:b/>
+          <w:lang w:val="pl-PL"/>
         </w:rPr>
         <w:t>Minus:</w:t>
       </w:r>
       <w:r>
+        <w:rPr>
+          <w:lang w:val="pl-PL"/>
+        </w:rPr>
         <w:t xml:space="preserve"> klient może zatrzymać się po diagnozie.</w:t>
       </w:r>
     </w:p>
     <w:p>
       <w:pPr>
         <w:pStyle w:val="Nagwek3"/>
-      </w:pPr>
-      <w:r>
+        <w:rPr>
+          <w:lang w:val="pl-PL"/>
+        </w:rPr>
+      </w:pPr>
+      <w:r>
+        <w:rPr>
+          <w:lang w:val="pl-PL"/>
+        </w:rPr>
         <w:t>Krok 3. Badanie: ankieta i dane wewnętrzne (ok. 3–4 tygodnie)</w:t>
       </w:r>
     </w:p>
     <w:p>
+      <w:pPr>
+        <w:rPr>
+          <w:lang w:val="pl-PL"/>
+        </w:rPr>
+      </w:pPr>
       <w:r>
         <w:rPr>
           <w:b/>
+          <w:lang w:val="pl-PL"/>
         </w:rPr>
         <w:t>Cel:</w:t>
       </w:r>
       <w:r>
+        <w:rPr>
+          <w:lang w:val="pl-PL"/>
+        </w:rPr>
         <w:t xml:space="preserve"> zebrać dwa źródła: co mówią ludzie i co pokazuje organizacja.</w:t>
       </w:r>
     </w:p>
@@ -745,8 +1536,14 @@
           <w:ilvl w:val="0"/>
           <w:numId w:val="6"/>
         </w:numPr>
-      </w:pPr>
-      <w:r>
+        <w:rPr>
+          <w:lang w:val="pl-PL"/>
+        </w:rPr>
+      </w:pPr>
+      <w:r>
+        <w:rPr>
+          <w:lang w:val="pl-PL"/>
+        </w:rPr>
         <w:t>Komunikat zarządu przed badaniem: po co, kto zobaczy wyniki, odpowiedzi idą do fundacji, nie do pracodawcy.</w:t>
       </w:r>
     </w:p>
@@ -757,8 +1554,15 @@
           <w:ilvl w:val="0"/>
           <w:numId w:val="6"/>
         </w:numPr>
-      </w:pPr>
-      <w:r>
+        <w:rPr>
+          <w:lang w:val="pl-PL"/>
+        </w:rPr>
+      </w:pPr>
+      <w:r>
+        <w:rPr>
+          <w:lang w:val="pl-PL"/>
+        </w:rPr>
+        <w:lastRenderedPageBreak/>
         <w:t>Ankieta z linkiem lub kodem QR dla każdego zespołu, dostęp mobilny dla pracowników bez komputera.</w:t>
       </w:r>
     </w:p>
@@ -769,8 +1573,14 @@
           <w:ilvl w:val="0"/>
           <w:numId w:val="6"/>
         </w:numPr>
-      </w:pPr>
-      <w:r>
+        <w:rPr>
+          <w:lang w:val="pl-PL"/>
+        </w:rPr>
+      </w:pPr>
+      <w:r>
+        <w:rPr>
+          <w:lang w:val="pl-PL"/>
+        </w:rPr>
         <w:t>Śledzenie frekwencji w zespołach, przypomnienia.</w:t>
       </w:r>
     </w:p>
@@ -781,8 +1591,14 @@
           <w:ilvl w:val="0"/>
           <w:numId w:val="6"/>
         </w:numPr>
-      </w:pPr>
-      <w:r>
+        <w:rPr>
+          <w:lang w:val="pl-PL"/>
+        </w:rPr>
+      </w:pPr>
+      <w:r>
+        <w:rPr>
+          <w:lang w:val="pl-PL"/>
+        </w:rPr>
         <w:t>Dane wewnętrzne z 12–24 miesięcy: rotacja, absencja, zgłoszenia, usprawnienia, wskaźniki branżowe.</w:t>
       </w:r>
     </w:p>
@@ -793,9 +1609,29 @@
           <w:ilvl w:val="0"/>
           <w:numId w:val="6"/>
         </w:numPr>
-      </w:pPr>
-      <w:r>
-        <w:t>Przegląd procedur: kanał zgłoszeń, polityka wynagrodzeń, procedura antymobbingowa, konsultacje.</w:t>
+        <w:rPr>
+          <w:lang w:val="pl-PL"/>
+        </w:rPr>
+      </w:pPr>
+      <w:r>
+        <w:rPr>
+          <w:lang w:val="pl-PL"/>
+        </w:rPr>
+        <w:t xml:space="preserve">Przegląd procedur: kanał zgłoszeń, polityka wynagrodzeń, procedura </w:t>
+      </w:r>
+      <w:proofErr w:type="spellStart"/>
+      <w:r>
+        <w:rPr>
+          <w:lang w:val="pl-PL"/>
+        </w:rPr>
+        <w:t>antymobbingowa</w:t>
+      </w:r>
+      <w:proofErr w:type="spellEnd"/>
+      <w:r>
+        <w:rPr>
+          <w:lang w:val="pl-PL"/>
+        </w:rPr>
+        <w:t>, konsultacje.</w:t>
       </w:r>
     </w:p>
     <w:p>
@@ -805,59 +1641,101 @@
           <w:ilvl w:val="0"/>
           <w:numId w:val="6"/>
         </w:numPr>
-      </w:pPr>
-      <w:r>
-        <w:lastRenderedPageBreak/>
+        <w:rPr>
+          <w:lang w:val="pl-PL"/>
+        </w:rPr>
+      </w:pPr>
+      <w:r>
+        <w:rPr>
+          <w:lang w:val="pl-PL"/>
+        </w:rPr>
         <w:t>Brak danych zapisujemy jako wynik: organizacja nie zbiera sygnałów.</w:t>
       </w:r>
     </w:p>
     <w:p>
+      <w:pPr>
+        <w:rPr>
+          <w:lang w:val="pl-PL"/>
+        </w:rPr>
+      </w:pPr>
       <w:r>
         <w:rPr>
           <w:b/>
+          <w:lang w:val="pl-PL"/>
         </w:rPr>
         <w:t>Rezultat:</w:t>
       </w:r>
       <w:r>
+        <w:rPr>
+          <w:lang w:val="pl-PL"/>
+        </w:rPr>
         <w:t xml:space="preserve"> ankieta z akceptowalną frekwencją, dane i lista luk w danych.</w:t>
       </w:r>
     </w:p>
     <w:p>
+      <w:pPr>
+        <w:rPr>
+          <w:lang w:val="pl-PL"/>
+        </w:rPr>
+      </w:pPr>
       <w:r>
         <w:rPr>
           <w:b/>
+          <w:lang w:val="pl-PL"/>
         </w:rPr>
         <w:t>Plus:</w:t>
       </w:r>
       <w:r>
+        <w:rPr>
+          <w:lang w:val="pl-PL"/>
+        </w:rPr>
         <w:t xml:space="preserve"> dwa źródła danych odróżniają diagnozę od badania nastrojów. </w:t>
       </w:r>
       <w:r>
         <w:rPr>
           <w:b/>
+          <w:lang w:val="pl-PL"/>
         </w:rPr>
         <w:t>Minus:</w:t>
       </w:r>
       <w:r>
+        <w:rPr>
+          <w:lang w:val="pl-PL"/>
+        </w:rPr>
         <w:t xml:space="preserve"> zależność od jakości danych HR klienta.</w:t>
       </w:r>
     </w:p>
     <w:p>
       <w:pPr>
         <w:pStyle w:val="Nagwek3"/>
-      </w:pPr>
-      <w:r>
+        <w:rPr>
+          <w:lang w:val="pl-PL"/>
+        </w:rPr>
+      </w:pPr>
+      <w:r>
+        <w:rPr>
+          <w:lang w:val="pl-PL"/>
+        </w:rPr>
         <w:t>Krok 4. Analiza i Kalkulator (ok. 2–3 tygodnie)</w:t>
       </w:r>
     </w:p>
     <w:p>
+      <w:pPr>
+        <w:rPr>
+          <w:lang w:val="pl-PL"/>
+        </w:rPr>
+      </w:pPr>
       <w:r>
         <w:rPr>
           <w:b/>
+          <w:lang w:val="pl-PL"/>
         </w:rPr>
         <w:t>Cel:</w:t>
       </w:r>
       <w:r>
+        <w:rPr>
+          <w:lang w:val="pl-PL"/>
+        </w:rPr>
         <w:t xml:space="preserve"> przełożyć dane na obraz ryzyka zrozumiały dla zarządu.</w:t>
       </w:r>
     </w:p>
@@ -868,8 +1746,14 @@
           <w:ilvl w:val="0"/>
           <w:numId w:val="7"/>
         </w:numPr>
-      </w:pPr>
-      <w:r>
+        <w:rPr>
+          <w:lang w:val="pl-PL"/>
+        </w:rPr>
+      </w:pPr>
+      <w:r>
+        <w:rPr>
+          <w:lang w:val="pl-PL"/>
+        </w:rPr>
         <w:t>Wyniki w 10 filarach i na czterech poziomach.</w:t>
       </w:r>
     </w:p>
@@ -881,8 +1765,21 @@
           <w:numId w:val="7"/>
         </w:numPr>
       </w:pPr>
-      <w:r>
-        <w:t>Porównanie z benchmarkiem Ipsos.</w:t>
+      <w:proofErr w:type="spellStart"/>
+      <w:r>
+        <w:t>Porównanie</w:t>
+      </w:r>
+      <w:proofErr w:type="spellEnd"/>
+      <w:r>
+        <w:t xml:space="preserve"> z </w:t>
+      </w:r>
+      <w:proofErr w:type="spellStart"/>
+      <w:r>
+        <w:t>benchmarkiem</w:t>
+      </w:r>
+      <w:proofErr w:type="spellEnd"/>
+      <w:r>
+        <w:t xml:space="preserve"> Ipsos.</w:t>
       </w:r>
     </w:p>
     <w:p>
@@ -892,8 +1789,14 @@
           <w:ilvl w:val="0"/>
           <w:numId w:val="7"/>
         </w:numPr>
-      </w:pPr>
-      <w:r>
+        <w:rPr>
+          <w:lang w:val="pl-PL"/>
+        </w:rPr>
+      </w:pPr>
+      <w:r>
+        <w:rPr>
+          <w:lang w:val="pl-PL"/>
+        </w:rPr>
         <w:t>Mapa zespołów: gdzie najwięcej milczenia, gdzie dobre praktyki.</w:t>
       </w:r>
     </w:p>
@@ -904,8 +1807,14 @@
           <w:ilvl w:val="0"/>
           <w:numId w:val="7"/>
         </w:numPr>
-      </w:pPr>
-      <w:r>
+        <w:rPr>
+          <w:lang w:val="pl-PL"/>
+        </w:rPr>
+      </w:pPr>
+      <w:r>
+        <w:rPr>
+          <w:lang w:val="pl-PL"/>
+        </w:rPr>
         <w:t>Zestawienie ankiety z danymi wewnętrznymi.</w:t>
       </w:r>
     </w:p>
@@ -916,8 +1825,14 @@
           <w:ilvl w:val="0"/>
           <w:numId w:val="7"/>
         </w:numPr>
-      </w:pPr>
-      <w:r>
+        <w:rPr>
+          <w:lang w:val="pl-PL"/>
+        </w:rPr>
+      </w:pPr>
+      <w:r>
+        <w:rPr>
+          <w:lang w:val="pl-PL"/>
+        </w:rPr>
         <w:t>Kalkulator: skala kosztów ryzyka jako przedziały i scenariusze, z wypisanymi założeniami.</w:t>
       </w:r>
     </w:p>
@@ -930,75 +1845,138 @@
         </w:numPr>
       </w:pPr>
       <w:r>
-        <w:t>3–5 priorytetów.</w:t>
-      </w:r>
-    </w:p>
-    <w:p>
+        <w:t xml:space="preserve">3–5 </w:t>
+      </w:r>
+      <w:proofErr w:type="spellStart"/>
+      <w:r>
+        <w:t>priorytetów</w:t>
+      </w:r>
+      <w:proofErr w:type="spellEnd"/>
+      <w:r>
+        <w:t>.</w:t>
+      </w:r>
+    </w:p>
+    <w:p>
+      <w:pPr>
+        <w:rPr>
+          <w:lang w:val="pl-PL"/>
+        </w:rPr>
+      </w:pPr>
       <w:r>
         <w:rPr>
           <w:b/>
+          <w:lang w:val="pl-PL"/>
         </w:rPr>
         <w:t>Firma dostaje:</w:t>
       </w:r>
       <w:r>
+        <w:rPr>
+          <w:lang w:val="pl-PL"/>
+        </w:rPr>
         <w:t xml:space="preserve"> raport diagnostyczny i wersję skróconą dla zarządu.</w:t>
       </w:r>
     </w:p>
     <w:p>
+      <w:pPr>
+        <w:rPr>
+          <w:lang w:val="pl-PL"/>
+        </w:rPr>
+      </w:pPr>
       <w:r>
         <w:rPr>
           <w:b/>
+          <w:lang w:val="pl-PL"/>
         </w:rPr>
         <w:t>Plus:</w:t>
       </w:r>
       <w:r>
+        <w:rPr>
+          <w:lang w:val="pl-PL"/>
+        </w:rPr>
         <w:t xml:space="preserve"> jedyny element na rynku łączący pomiar z danymi operacyjnymi firmy. </w:t>
       </w:r>
       <w:r>
         <w:rPr>
           <w:b/>
+          <w:lang w:val="pl-PL"/>
         </w:rPr>
         <w:t>Minus:</w:t>
       </w:r>
       <w:r>
+        <w:rPr>
+          <w:lang w:val="pl-PL"/>
+        </w:rPr>
         <w:t xml:space="preserve"> ryzyko, że zarząd zakotwiczy się na jednej liczbie.</w:t>
       </w:r>
     </w:p>
     <w:p>
       <w:pPr>
         <w:rPr>
-          <w:ins w:id="9031" w:author="Paweł Mamcarz" w:date="2026-10-03T12:00:00Z"/>
-        </w:rPr>
-      </w:pPr>
-      <w:ins w:id="9032" w:author="Paweł Mamcarz" w:date="2026-10-03T12:00:00Z">
+          <w:ins w:id="0" w:author="Paweł Mamcarz" w:date="2026-10-03T12:00:00Z"/>
+          <w:lang w:val="pl-PL"/>
+        </w:rPr>
+      </w:pPr>
+      <w:ins w:id="1" w:author="Paweł Mamcarz" w:date="2026-10-03T12:00:00Z">
         <w:r>
           <w:rPr>
             <w:b/>
+            <w:lang w:val="pl-PL"/>
           </w:rPr>
           <w:t xml:space="preserve">Uwaga Pawła (Kalkulator): </w:t>
         </w:r>
         <w:r>
-          <w:rPr/>
-          <w:t xml:space="preserve">dziś Kalkulator liczy scenariusz skali z sześciu danych firmy (przychód, koszty, FTE, płaca, rotacja, klimat). Nie jest jeszcze powiązany z ankietą, nie liczy 10 filarów ani czterech poziomów i nie zestawia ankiety z rotacją, absencją i zgłoszeniami; nie ma też metody przed/po (krok 9). To trzeba dobudować (zob. brief, pyt. 15, 19, 24). Do czasu wdrożenia proponuję ostrożniejsze sformułowanie niż „jedyny element na rynku”.</w:t>
+          <w:rPr>
+            <w:lang w:val="pl-PL"/>
+          </w:rPr>
+          <w:t xml:space="preserve">dziś Kalkulator liczy scenariusz skali z sześciu danych firmy (przychód, koszty, FTE, płaca, rotacja, klimat). Nie jest jeszcze powiązany z ankietą, nie liczy 10 filarów ani czterech poziomów i nie zestawia ankiety z rotacją, absencją i zgłoszeniami; nie ma też metody przed/po (krok 9). To trzeba dobudować (zob. </w:t>
+        </w:r>
+        <w:proofErr w:type="spellStart"/>
+        <w:r>
+          <w:rPr>
+            <w:lang w:val="pl-PL"/>
+          </w:rPr>
+          <w:t>brief</w:t>
+        </w:r>
+        <w:proofErr w:type="spellEnd"/>
+        <w:r>
+          <w:rPr>
+            <w:lang w:val="pl-PL"/>
+          </w:rPr>
+          <w:t>, pyt. 15, 19, 24). Do czasu wdrożenia proponuję ostrożniejsze sformułowanie niż „jedyny element na rynku”.</w:t>
         </w:r>
       </w:ins>
     </w:p>
     <w:p>
       <w:pPr>
         <w:pStyle w:val="Nagwek3"/>
-      </w:pPr>
-      <w:r>
+        <w:rPr>
+          <w:lang w:val="pl-PL"/>
+        </w:rPr>
+      </w:pPr>
+      <w:r>
+        <w:rPr>
+          <w:lang w:val="pl-PL"/>
+        </w:rPr>
         <w:t>Krok 5. Diagnoza dla zarządu (2–3 godziny, warsztatowo)</w:t>
       </w:r>
     </w:p>
     <w:p>
+      <w:pPr>
+        <w:rPr>
+          <w:lang w:val="pl-PL"/>
+        </w:rPr>
+      </w:pPr>
       <w:r>
         <w:rPr>
           <w:b/>
+          <w:lang w:val="pl-PL"/>
         </w:rPr>
         <w:t>Cel:</w:t>
       </w:r>
       <w:r>
+        <w:rPr>
+          <w:lang w:val="pl-PL"/>
+        </w:rPr>
         <w:t xml:space="preserve"> zarząd przyjmuje diagnozę i wybiera priorytety.</w:t>
       </w:r>
     </w:p>
@@ -1009,8 +1987,14 @@
           <w:ilvl w:val="0"/>
           <w:numId w:val="8"/>
         </w:numPr>
-      </w:pPr>
-      <w:r>
+        <w:rPr>
+          <w:lang w:val="pl-PL"/>
+        </w:rPr>
+      </w:pPr>
+      <w:r>
+        <w:rPr>
+          <w:lang w:val="pl-PL"/>
+        </w:rPr>
         <w:t>Najważniejsze wnioski: co działa, gdzie ryzyko, ile może kosztować (przedział).</w:t>
       </w:r>
     </w:p>
@@ -1021,8 +2005,14 @@
           <w:ilvl w:val="0"/>
           <w:numId w:val="8"/>
         </w:numPr>
-      </w:pPr>
-      <w:r>
+        <w:rPr>
+          <w:lang w:val="pl-PL"/>
+        </w:rPr>
+      </w:pPr>
+      <w:r>
+        <w:rPr>
+          <w:lang w:val="pl-PL"/>
+        </w:rPr>
         <w:t>Lustro dla zarządu: co wyniki mówią o stylu zarządzania na górze.</w:t>
       </w:r>
     </w:p>
@@ -1033,8 +2023,14 @@
           <w:ilvl w:val="0"/>
           <w:numId w:val="8"/>
         </w:numPr>
-      </w:pPr>
-      <w:r>
+        <w:rPr>
+          <w:lang w:val="pl-PL"/>
+        </w:rPr>
+      </w:pPr>
+      <w:r>
+        <w:rPr>
+          <w:lang w:val="pl-PL"/>
+        </w:rPr>
         <w:t>Jak reagować na wyniki bez szukania winnych.</w:t>
       </w:r>
     </w:p>
@@ -1045,8 +2041,14 @@
           <w:ilvl w:val="0"/>
           <w:numId w:val="8"/>
         </w:numPr>
-      </w:pPr>
-      <w:r>
+        <w:rPr>
+          <w:lang w:val="pl-PL"/>
+        </w:rPr>
+      </w:pPr>
+      <w:r>
+        <w:rPr>
+          <w:lang w:val="pl-PL"/>
+        </w:rPr>
         <w:t>Wybór 2–3 priorytetów i wstępny plan działań.</w:t>
       </w:r>
     </w:p>
@@ -1057,58 +2059,116 @@
           <w:ilvl w:val="0"/>
           <w:numId w:val="8"/>
         </w:numPr>
-      </w:pPr>
-      <w:r>
-        <w:t>Indywidualne zobowiązania członków zarządu co do własnych zachowań.</w:t>
-      </w:r>
-    </w:p>
-    <w:p>
+        <w:rPr>
+          <w:lang w:val="pl-PL"/>
+        </w:rPr>
+      </w:pPr>
+      <w:r>
+        <w:rPr>
+          <w:lang w:val="pl-PL"/>
+        </w:rPr>
+        <w:t xml:space="preserve">Indywidualne zobowiązania członków zarządu co do własnych </w:t>
+      </w:r>
+      <w:proofErr w:type="spellStart"/>
+      <w:r>
+        <w:rPr>
+          <w:lang w:val="pl-PL"/>
+        </w:rPr>
+        <w:t>zachowań</w:t>
+      </w:r>
+      <w:proofErr w:type="spellEnd"/>
+      <w:r>
+        <w:rPr>
+          <w:lang w:val="pl-PL"/>
+        </w:rPr>
+        <w:t>.</w:t>
+      </w:r>
+    </w:p>
+    <w:p>
+      <w:pPr>
+        <w:rPr>
+          <w:lang w:val="pl-PL"/>
+        </w:rPr>
+      </w:pPr>
       <w:r>
         <w:rPr>
           <w:b/>
+          <w:lang w:val="pl-PL"/>
         </w:rPr>
         <w:t>Rezultat:</w:t>
       </w:r>
       <w:r>
+        <w:rPr>
+          <w:lang w:val="pl-PL"/>
+        </w:rPr>
         <w:t xml:space="preserve"> priorytety, zobowiązania zarządu, decyzja o etapie 2.</w:t>
       </w:r>
     </w:p>
     <w:p>
+      <w:pPr>
+        <w:rPr>
+          <w:lang w:val="pl-PL"/>
+        </w:rPr>
+      </w:pPr>
       <w:r>
         <w:rPr>
           <w:b/>
+          <w:lang w:val="pl-PL"/>
         </w:rPr>
         <w:t>Plus:</w:t>
       </w:r>
       <w:r>
+        <w:rPr>
+          <w:lang w:val="pl-PL"/>
+        </w:rPr>
         <w:t xml:space="preserve"> naturalny moment sprzedaży etapu 2, gdy dane mówią same za siebie. </w:t>
       </w:r>
       <w:r>
         <w:rPr>
           <w:b/>
+          <w:lang w:val="pl-PL"/>
         </w:rPr>
         <w:t>Minus:</w:t>
       </w:r>
       <w:r>
+        <w:rPr>
+          <w:lang w:val="pl-PL"/>
+        </w:rPr>
         <w:t xml:space="preserve"> trudna rozmowa; zarząd może odrzucić „lustro”.</w:t>
       </w:r>
     </w:p>
     <w:p>
       <w:pPr>
         <w:pStyle w:val="Nagwek3"/>
-      </w:pPr>
-      <w:r>
+        <w:rPr>
+          <w:lang w:val="pl-PL"/>
+        </w:rPr>
+      </w:pPr>
+      <w:r>
+        <w:rPr>
+          <w:lang w:val="pl-PL"/>
+        </w:rPr>
+        <w:lastRenderedPageBreak/>
         <w:t>Krok 6. Umowa – etap 2 i powrót wyników do organizacji</w:t>
       </w:r>
     </w:p>
     <w:p>
+      <w:pPr>
+        <w:rPr>
+          <w:lang w:val="pl-PL"/>
+        </w:rPr>
+      </w:pPr>
       <w:r>
         <w:rPr>
           <w:b/>
+          <w:lang w:val="pl-PL"/>
         </w:rPr>
         <w:t>Cel:</w:t>
       </w:r>
       <w:r>
+        <w:rPr>
+          <w:lang w:val="pl-PL"/>
+        </w:rPr>
         <w:t xml:space="preserve"> zamknąć pętlę z pracownikami i uruchomić działania.</w:t>
       </w:r>
     </w:p>
@@ -1119,8 +2179,14 @@
           <w:ilvl w:val="0"/>
           <w:numId w:val="9"/>
         </w:numPr>
-      </w:pPr>
-      <w:r>
+        <w:rPr>
+          <w:lang w:val="pl-PL"/>
+        </w:rPr>
+      </w:pPr>
+      <w:r>
+        <w:rPr>
+          <w:lang w:val="pl-PL"/>
+        </w:rPr>
         <w:t>Podpisanie etapu 2 (działania, monitoring, ponowny pomiar).</w:t>
       </w:r>
     </w:p>
@@ -1131,8 +2197,14 @@
           <w:ilvl w:val="0"/>
           <w:numId w:val="9"/>
         </w:numPr>
-      </w:pPr>
-      <w:r>
+        <w:rPr>
+          <w:lang w:val="pl-PL"/>
+        </w:rPr>
+      </w:pPr>
+      <w:r>
+        <w:rPr>
+          <w:lang w:val="pl-PL"/>
+        </w:rPr>
         <w:t>Komunikat zarządu do firmy: co usłyszeliśmy i co z tym zrobimy.</w:t>
       </w:r>
     </w:p>
@@ -1143,8 +2215,14 @@
           <w:ilvl w:val="0"/>
           <w:numId w:val="9"/>
         </w:numPr>
-      </w:pPr>
-      <w:r>
+        <w:rPr>
+          <w:lang w:val="pl-PL"/>
+        </w:rPr>
+      </w:pPr>
+      <w:r>
+        <w:rPr>
+          <w:lang w:val="pl-PL"/>
+        </w:rPr>
         <w:t>Przygotowanie liderów do rozmowy o wyniku, zwłaszcza tych z trudnym wynikiem.</w:t>
       </w:r>
     </w:p>
@@ -1155,60 +2233,130 @@
           <w:ilvl w:val="0"/>
           <w:numId w:val="9"/>
         </w:numPr>
-      </w:pPr>
-      <w:r>
+        <w:rPr>
+          <w:lang w:val="pl-PL"/>
+        </w:rPr>
+      </w:pPr>
+      <w:r>
+        <w:rPr>
+          <w:lang w:val="pl-PL"/>
+        </w:rPr>
         <w:t>Sesje z zespołami: omówienie wyniku, rozmowa o przyczynach, wybór 1–2 rzeczy do zmiany.</w:t>
       </w:r>
     </w:p>
     <w:p>
+      <w:pPr>
+        <w:rPr>
+          <w:lang w:val="pl-PL"/>
+        </w:rPr>
+      </w:pPr>
       <w:r>
         <w:rPr>
           <w:b/>
+          <w:lang w:val="pl-PL"/>
         </w:rPr>
         <w:t>Rezultat:</w:t>
       </w:r>
       <w:r>
+        <w:rPr>
+          <w:lang w:val="pl-PL"/>
+        </w:rPr>
         <w:t xml:space="preserve"> każdy zespół zna swój wynik i ma własne zobowiązania.</w:t>
       </w:r>
     </w:p>
     <w:p>
+      <w:pPr>
+        <w:rPr>
+          <w:lang w:val="pl-PL"/>
+        </w:rPr>
+      </w:pPr>
       <w:r>
         <w:rPr>
           <w:b/>
+          <w:lang w:val="pl-PL"/>
         </w:rPr>
         <w:t>Plus:</w:t>
       </w:r>
       <w:r>
+        <w:rPr>
+          <w:lang w:val="pl-PL"/>
+        </w:rPr>
         <w:t xml:space="preserve"> odbudowuje zaufanie do ankiet i chroni wiarygodność ponownego pomiaru. </w:t>
       </w:r>
       <w:r>
         <w:rPr>
           <w:b/>
+          <w:lang w:val="pl-PL"/>
         </w:rPr>
         <w:t>Minus:</w:t>
       </w:r>
       <w:r>
+        <w:rPr>
+          <w:lang w:val="pl-PL"/>
+        </w:rPr>
         <w:t xml:space="preserve"> wymaga czasu liderów i odwagi zarządu.</w:t>
       </w:r>
     </w:p>
     <w:p>
       <w:pPr>
         <w:pStyle w:val="Nagwek3"/>
-      </w:pPr>
-      <w:r>
-        <w:lastRenderedPageBreak/>
+        <w:rPr>
+          <w:lang w:val="pl-PL"/>
+        </w:rPr>
+      </w:pPr>
+      <w:r>
+        <w:rPr>
+          <w:lang w:val="pl-PL"/>
+        </w:rPr>
         <w:t>Krok 7. Działania na rzecz zmiany postaw (ok. 6–9 miesięcy)</w:t>
       </w:r>
     </w:p>
     <w:p>
+      <w:pPr>
+        <w:rPr>
+          <w:lang w:val="pl-PL"/>
+        </w:rPr>
+      </w:pPr>
       <w:r>
         <w:rPr>
           <w:b/>
+          <w:lang w:val="pl-PL"/>
         </w:rPr>
         <w:t>Cel:</w:t>
       </w:r>
       <w:r>
-        <w:t xml:space="preserve"> zmiana zachowań w codziennej pracy, nie wiedza z sali szkoleniowej.</w:t>
+        <w:rPr>
+          <w:lang w:val="pl-PL"/>
+        </w:rPr>
+        <w:t xml:space="preserve"> zmiana </w:t>
+      </w:r>
+      <w:proofErr w:type="spellStart"/>
+      <w:r>
+        <w:rPr>
+          <w:lang w:val="pl-PL"/>
+        </w:rPr>
+        <w:t>zachowań</w:t>
+      </w:r>
+      <w:proofErr w:type="spellEnd"/>
+      <w:r>
+        <w:rPr>
+          <w:lang w:val="pl-PL"/>
+        </w:rPr>
+        <w:t xml:space="preserve"> w codziennej pracy, </w:t>
+      </w:r>
+      <w:proofErr w:type="gramStart"/>
+      <w:r>
+        <w:rPr>
+          <w:lang w:val="pl-PL"/>
+        </w:rPr>
+        <w:t>nie wiedza</w:t>
+      </w:r>
+      <w:proofErr w:type="gramEnd"/>
+      <w:r>
+        <w:rPr>
+          <w:lang w:val="pl-PL"/>
+        </w:rPr>
+        <w:t xml:space="preserve"> z sali szkoleniowej.</w:t>
       </w:r>
     </w:p>
     <w:p>
@@ -1218,8 +2366,14 @@
           <w:ilvl w:val="0"/>
           <w:numId w:val="10"/>
         </w:numPr>
-      </w:pPr>
-      <w:r>
+        <w:rPr>
+          <w:lang w:val="pl-PL"/>
+        </w:rPr>
+      </w:pPr>
+      <w:r>
+        <w:rPr>
+          <w:lang w:val="pl-PL"/>
+        </w:rPr>
         <w:t>Każde działanie przypisane do deficytu z diagnozy.</w:t>
       </w:r>
     </w:p>
@@ -1230,9 +2384,29 @@
           <w:ilvl w:val="0"/>
           <w:numId w:val="10"/>
         </w:numPr>
-      </w:pPr>
-      <w:r>
-        <w:t>Zarząd w programie: własne sesje i praca nad zachowaniami.</w:t>
+        <w:rPr>
+          <w:lang w:val="pl-PL"/>
+        </w:rPr>
+      </w:pPr>
+      <w:r>
+        <w:rPr>
+          <w:lang w:val="pl-PL"/>
+        </w:rPr>
+        <w:t xml:space="preserve">Zarząd w programie: własne sesje i praca nad </w:t>
+      </w:r>
+      <w:proofErr w:type="spellStart"/>
+      <w:r>
+        <w:rPr>
+          <w:lang w:val="pl-PL"/>
+        </w:rPr>
+        <w:t>zachowaniami</w:t>
+      </w:r>
+      <w:proofErr w:type="spellEnd"/>
+      <w:r>
+        <w:rPr>
+          <w:lang w:val="pl-PL"/>
+        </w:rPr>
+        <w:t>.</w:t>
       </w:r>
     </w:p>
     <w:p>
@@ -1242,8 +2416,14 @@
           <w:ilvl w:val="0"/>
           <w:numId w:val="10"/>
         </w:numPr>
-      </w:pPr>
-      <w:r>
+        <w:rPr>
+          <w:lang w:val="pl-PL"/>
+        </w:rPr>
+      </w:pPr>
+      <w:r>
+        <w:rPr>
+          <w:lang w:val="pl-PL"/>
+        </w:rPr>
         <w:t>Liderzy: krótkie warsztaty plus coaching między nimi, na prawdziwych sytuacjach.</w:t>
       </w:r>
     </w:p>
@@ -1254,8 +2434,14 @@
           <w:ilvl w:val="0"/>
           <w:numId w:val="10"/>
         </w:numPr>
-      </w:pPr>
-      <w:r>
+        <w:rPr>
+          <w:lang w:val="pl-PL"/>
+        </w:rPr>
+      </w:pPr>
+      <w:r>
+        <w:rPr>
+          <w:lang w:val="pl-PL"/>
+        </w:rPr>
         <w:t>Zespoły: rytuały w codziennej pracy (runda głosów, omawianie błędów bez szukania winnych, analiza przed startem projektu).</w:t>
       </w:r>
     </w:p>
@@ -1266,8 +2452,14 @@
           <w:ilvl w:val="0"/>
           <w:numId w:val="10"/>
         </w:numPr>
-      </w:pPr>
-      <w:r>
+        <w:rPr>
+          <w:lang w:val="pl-PL"/>
+        </w:rPr>
+      </w:pPr>
+      <w:r>
+        <w:rPr>
+          <w:lang w:val="pl-PL"/>
+        </w:rPr>
         <w:t>Co najmniej jedna zmiana systemowa (kanał zgłoszeń, przejrzystość kryteriów, konsultacje).</w:t>
       </w:r>
     </w:p>
@@ -1278,8 +2470,14 @@
           <w:ilvl w:val="0"/>
           <w:numId w:val="10"/>
         </w:numPr>
-      </w:pPr>
-      <w:r>
+        <w:rPr>
+          <w:lang w:val="pl-PL"/>
+        </w:rPr>
+      </w:pPr>
+      <w:r>
+        <w:rPr>
+          <w:lang w:val="pl-PL"/>
+        </w:rPr>
         <w:t>Narzędzia tylko tam, gdzie wspierają zmianę zachowania.</w:t>
       </w:r>
     </w:p>
@@ -1290,58 +2488,115 @@
           <w:ilvl w:val="0"/>
           <w:numId w:val="10"/>
         </w:numPr>
-      </w:pPr>
-      <w:r>
+        <w:rPr>
+          <w:lang w:val="pl-PL"/>
+        </w:rPr>
+      </w:pPr>
+      <w:r>
+        <w:rPr>
+          <w:lang w:val="pl-PL"/>
+        </w:rPr>
         <w:t>Cykle co 6–8 tygodni: sesja, praktyka w zespole, omówienie, korekta.</w:t>
       </w:r>
     </w:p>
     <w:p>
+      <w:pPr>
+        <w:rPr>
+          <w:lang w:val="pl-PL"/>
+        </w:rPr>
+      </w:pPr>
       <w:r>
         <w:rPr>
           <w:b/>
+          <w:lang w:val="pl-PL"/>
         </w:rPr>
         <w:t>Firma dostaje:</w:t>
       </w:r>
       <w:r>
+        <w:rPr>
+          <w:lang w:val="pl-PL"/>
+        </w:rPr>
         <w:t xml:space="preserve"> program działań i dziennik zmian (co zrobiono, gdzie, z jakim efektem).</w:t>
       </w:r>
     </w:p>
     <w:p>
+      <w:pPr>
+        <w:rPr>
+          <w:lang w:val="pl-PL"/>
+        </w:rPr>
+      </w:pPr>
       <w:r>
         <w:rPr>
           <w:b/>
+          <w:lang w:val="pl-PL"/>
         </w:rPr>
         <w:t>Plus:</w:t>
       </w:r>
       <w:r>
+        <w:rPr>
+          <w:lang w:val="pl-PL"/>
+        </w:rPr>
         <w:t xml:space="preserve"> realny wyróżnik wobec firm szkoleniowych. </w:t>
       </w:r>
       <w:r>
         <w:rPr>
           <w:b/>
+          <w:lang w:val="pl-PL"/>
         </w:rPr>
         <w:t>Minus:</w:t>
       </w:r>
       <w:r>
-        <w:t xml:space="preserve"> najdroższy i najtrudniejszy do dowiezienia etap; wymaga puli facylitatorów.</w:t>
+        <w:rPr>
+          <w:lang w:val="pl-PL"/>
+        </w:rPr>
+        <w:t xml:space="preserve"> najdroższy i najtrudniejszy do dowiezienia etap; wymaga puli </w:t>
+      </w:r>
+      <w:proofErr w:type="spellStart"/>
+      <w:r>
+        <w:rPr>
+          <w:lang w:val="pl-PL"/>
+        </w:rPr>
+        <w:t>facylitatorów</w:t>
+      </w:r>
+      <w:proofErr w:type="spellEnd"/>
+      <w:r>
+        <w:rPr>
+          <w:lang w:val="pl-PL"/>
+        </w:rPr>
+        <w:t>.</w:t>
       </w:r>
     </w:p>
     <w:p>
       <w:pPr>
         <w:pStyle w:val="Nagwek3"/>
-      </w:pPr>
-      <w:r>
+        <w:rPr>
+          <w:lang w:val="pl-PL"/>
+        </w:rPr>
+      </w:pPr>
+      <w:r>
+        <w:rPr>
+          <w:lang w:val="pl-PL"/>
+        </w:rPr>
         <w:t>Krok 8. Monitoring w trakcie (co kwartał)</w:t>
       </w:r>
     </w:p>
     <w:p>
+      <w:pPr>
+        <w:rPr>
+          <w:lang w:val="pl-PL"/>
+        </w:rPr>
+      </w:pPr>
       <w:r>
         <w:rPr>
           <w:b/>
+          <w:lang w:val="pl-PL"/>
         </w:rPr>
         <w:t>Cel:</w:t>
       </w:r>
       <w:r>
+        <w:rPr>
+          <w:lang w:val="pl-PL"/>
+        </w:rPr>
         <w:t xml:space="preserve"> widzieć kierunek zmian przed upływem roku.</w:t>
       </w:r>
     </w:p>
@@ -1352,9 +2607,29 @@
           <w:ilvl w:val="0"/>
           <w:numId w:val="11"/>
         </w:numPr>
-      </w:pPr>
-      <w:r>
-        <w:t>Krótka ankieta pulsowa (8–10 pytań) w zespołach objętych działaniami.</w:t>
+        <w:rPr>
+          <w:lang w:val="pl-PL"/>
+        </w:rPr>
+      </w:pPr>
+      <w:r>
+        <w:rPr>
+          <w:lang w:val="pl-PL"/>
+        </w:rPr>
+        <w:t xml:space="preserve">Krótka ankieta </w:t>
+      </w:r>
+      <w:proofErr w:type="spellStart"/>
+      <w:r>
+        <w:rPr>
+          <w:lang w:val="pl-PL"/>
+        </w:rPr>
+        <w:t>pulsowa</w:t>
+      </w:r>
+      <w:proofErr w:type="spellEnd"/>
+      <w:r>
+        <w:rPr>
+          <w:lang w:val="pl-PL"/>
+        </w:rPr>
+        <w:t xml:space="preserve"> (8–10 pytań) w zespołach objętych działaniami.</w:t>
       </w:r>
     </w:p>
     <w:p>
@@ -1364,8 +2639,14 @@
           <w:ilvl w:val="0"/>
           <w:numId w:val="11"/>
         </w:numPr>
-      </w:pPr>
-      <w:r>
+        <w:rPr>
+          <w:lang w:val="pl-PL"/>
+        </w:rPr>
+      </w:pPr>
+      <w:r>
+        <w:rPr>
+          <w:lang w:val="pl-PL"/>
+        </w:rPr>
         <w:t>Wskaźniki wyprzedzające: zgłoszone problemy i pomysły, udział w rytuałach, zgłoszenia sygnalistów.</w:t>
       </w:r>
     </w:p>
@@ -1376,8 +2657,14 @@
           <w:ilvl w:val="0"/>
           <w:numId w:val="11"/>
         </w:numPr>
-      </w:pPr>
-      <w:r>
+        <w:rPr>
+          <w:lang w:val="pl-PL"/>
+        </w:rPr>
+      </w:pPr>
+      <w:r>
+        <w:rPr>
+          <w:lang w:val="pl-PL"/>
+        </w:rPr>
         <w:t>Przegląd z właścicielem projektu i korekty planu.</w:t>
       </w:r>
     </w:p>
@@ -1388,58 +2675,101 @@
           <w:ilvl w:val="0"/>
           <w:numId w:val="11"/>
         </w:numPr>
-      </w:pPr>
-      <w:r>
+        <w:rPr>
+          <w:lang w:val="pl-PL"/>
+        </w:rPr>
+      </w:pPr>
+      <w:r>
+        <w:rPr>
+          <w:lang w:val="pl-PL"/>
+        </w:rPr>
         <w:t>Przypomnienie: wzrost zgłoszeń to dobry sygnał.</w:t>
       </w:r>
     </w:p>
     <w:p>
+      <w:pPr>
+        <w:rPr>
+          <w:lang w:val="pl-PL"/>
+        </w:rPr>
+      </w:pPr>
       <w:r>
         <w:rPr>
           <w:b/>
+          <w:lang w:val="pl-PL"/>
         </w:rPr>
         <w:t>Firma dostaje:</w:t>
       </w:r>
       <w:r>
+        <w:rPr>
+          <w:lang w:val="pl-PL"/>
+        </w:rPr>
         <w:t xml:space="preserve"> krótki raport kwartalny.</w:t>
       </w:r>
     </w:p>
     <w:p>
+      <w:pPr>
+        <w:rPr>
+          <w:lang w:val="pl-PL"/>
+        </w:rPr>
+      </w:pPr>
       <w:r>
         <w:rPr>
           <w:b/>
+          <w:lang w:val="pl-PL"/>
         </w:rPr>
         <w:t>Plus:</w:t>
       </w:r>
       <w:r>
+        <w:rPr>
+          <w:lang w:val="pl-PL"/>
+        </w:rPr>
         <w:t xml:space="preserve"> zarząd widzi postęp, łatwiej utrzymać zaangażowanie. </w:t>
       </w:r>
       <w:r>
         <w:rPr>
           <w:b/>
+          <w:lang w:val="pl-PL"/>
         </w:rPr>
         <w:t>Minus:</w:t>
       </w:r>
       <w:r>
+        <w:rPr>
+          <w:lang w:val="pl-PL"/>
+        </w:rPr>
         <w:t xml:space="preserve"> kolejne ankiety, ryzyko zmęczenia.</w:t>
       </w:r>
     </w:p>
     <w:p>
       <w:pPr>
         <w:pStyle w:val="Nagwek3"/>
-      </w:pPr>
-      <w:r>
+        <w:rPr>
+          <w:lang w:val="pl-PL"/>
+        </w:rPr>
+      </w:pPr>
+      <w:r>
+        <w:rPr>
+          <w:lang w:val="pl-PL"/>
+        </w:rPr>
         <w:t>Krok 9. Ponowny pomiar (ok. 12 miesięcy od badania)</w:t>
       </w:r>
     </w:p>
     <w:p>
+      <w:pPr>
+        <w:rPr>
+          <w:lang w:val="pl-PL"/>
+        </w:rPr>
+      </w:pPr>
       <w:r>
         <w:rPr>
           <w:b/>
+          <w:lang w:val="pl-PL"/>
         </w:rPr>
         <w:t>Cel:</w:t>
       </w:r>
       <w:r>
+        <w:rPr>
+          <w:lang w:val="pl-PL"/>
+        </w:rPr>
         <w:t xml:space="preserve"> sprawdzić, co się zmieniło.</w:t>
       </w:r>
     </w:p>
@@ -1450,8 +2780,14 @@
           <w:ilvl w:val="0"/>
           <w:numId w:val="12"/>
         </w:numPr>
-      </w:pPr>
-      <w:r>
+        <w:rPr>
+          <w:lang w:val="pl-PL"/>
+        </w:rPr>
+      </w:pPr>
+      <w:r>
+        <w:rPr>
+          <w:lang w:val="pl-PL"/>
+        </w:rPr>
         <w:t>Ta sama ankieta na tych samych zasadach.</w:t>
       </w:r>
     </w:p>
@@ -1462,8 +2798,14 @@
           <w:ilvl w:val="0"/>
           <w:numId w:val="12"/>
         </w:numPr>
-      </w:pPr>
-      <w:r>
+        <w:rPr>
+          <w:lang w:val="pl-PL"/>
+        </w:rPr>
+      </w:pPr>
+      <w:r>
+        <w:rPr>
+          <w:lang w:val="pl-PL"/>
+        </w:rPr>
         <w:t>Aktualizacja danych wewnętrznych; wskaźniki HR jako trend.</w:t>
       </w:r>
     </w:p>
@@ -1474,8 +2816,15 @@
           <w:ilvl w:val="0"/>
           <w:numId w:val="12"/>
         </w:numPr>
-      </w:pPr>
-      <w:r>
+        <w:rPr>
+          <w:lang w:val="pl-PL"/>
+        </w:rPr>
+      </w:pPr>
+      <w:r>
+        <w:rPr>
+          <w:lang w:val="pl-PL"/>
+        </w:rPr>
+        <w:lastRenderedPageBreak/>
         <w:t>Porównanie przed i po: firma, zespoły objęte i nieobjęte działaniami.</w:t>
       </w:r>
     </w:p>
@@ -1486,48 +2835,96 @@
           <w:ilvl w:val="0"/>
           <w:numId w:val="12"/>
         </w:numPr>
-      </w:pPr>
-      <w:r>
+        <w:rPr>
+          <w:lang w:val="pl-PL"/>
+        </w:rPr>
+      </w:pPr>
+      <w:r>
+        <w:rPr>
+          <w:lang w:val="pl-PL"/>
+        </w:rPr>
         <w:t>Ponowne przeliczenie Kalkulatora i porównanie z benchmarkiem.</w:t>
       </w:r>
     </w:p>
     <w:p>
+      <w:pPr>
+        <w:rPr>
+          <w:lang w:val="pl-PL"/>
+        </w:rPr>
+      </w:pPr>
       <w:r>
         <w:rPr>
           <w:b/>
+          <w:lang w:val="pl-PL"/>
         </w:rPr>
         <w:t>Plus:</w:t>
       </w:r>
       <w:r>
+        <w:rPr>
+          <w:lang w:val="pl-PL"/>
+        </w:rPr>
         <w:t xml:space="preserve"> jedyny dowód efektu. </w:t>
       </w:r>
       <w:r>
         <w:rPr>
           <w:b/>
+          <w:lang w:val="pl-PL"/>
         </w:rPr>
         <w:t>Minus:</w:t>
       </w:r>
       <w:r>
+        <w:rPr>
+          <w:lang w:val="pl-PL"/>
+        </w:rPr>
         <w:t xml:space="preserve"> wynik może spaść (więcej zaufania to więcej zgłaszanych problemów), co trzeba uprzedzić w kroku 1.</w:t>
       </w:r>
     </w:p>
     <w:p>
       <w:pPr>
         <w:pStyle w:val="Nagwek3"/>
-      </w:pPr>
-      <w:r>
+        <w:rPr>
+          <w:lang w:val="pl-PL"/>
+        </w:rPr>
+      </w:pPr>
+      <w:r>
+        <w:rPr>
+          <w:lang w:val="pl-PL"/>
+        </w:rPr>
         <w:t>Krok 10. Raport końcowy i decyzja o dalszej współpracy</w:t>
       </w:r>
     </w:p>
     <w:p>
+      <w:pPr>
+        <w:rPr>
+          <w:lang w:val="pl-PL"/>
+        </w:rPr>
+      </w:pPr>
       <w:r>
         <w:rPr>
           <w:b/>
+          <w:lang w:val="pl-PL"/>
         </w:rPr>
         <w:t>Cel:</w:t>
       </w:r>
       <w:r>
-        <w:t xml:space="preserve"> zarząd wie, co się zmieniło, co nie, i co dalej.</w:t>
+        <w:rPr>
+          <w:lang w:val="pl-PL"/>
+        </w:rPr>
+        <w:t xml:space="preserve"> zarząd wie, co się zmieniło, co </w:t>
+      </w:r>
+      <w:proofErr w:type="gramStart"/>
+      <w:r>
+        <w:rPr>
+          <w:lang w:val="pl-PL"/>
+        </w:rPr>
+        <w:t>nie,</w:t>
+      </w:r>
+      <w:proofErr w:type="gramEnd"/>
+      <w:r>
+        <w:rPr>
+          <w:lang w:val="pl-PL"/>
+        </w:rPr>
+        <w:t xml:space="preserve"> i co dalej.</w:t>
       </w:r>
     </w:p>
     <w:p>
@@ -1537,8 +2934,14 @@
           <w:ilvl w:val="0"/>
           <w:numId w:val="13"/>
         </w:numPr>
-      </w:pPr>
-      <w:r>
+        <w:rPr>
+          <w:lang w:val="pl-PL"/>
+        </w:rPr>
+      </w:pPr>
+      <w:r>
+        <w:rPr>
+          <w:lang w:val="pl-PL"/>
+        </w:rPr>
         <w:t>Wyniki przed i po, opisane uczciwie: „zmiana zbiegła się z…”, nie „program spowodował…”.</w:t>
       </w:r>
     </w:p>
@@ -1549,8 +2952,14 @@
           <w:ilvl w:val="0"/>
           <w:numId w:val="13"/>
         </w:numPr>
-      </w:pPr>
-      <w:r>
+        <w:rPr>
+          <w:lang w:val="pl-PL"/>
+        </w:rPr>
+      </w:pPr>
+      <w:r>
+        <w:rPr>
+          <w:lang w:val="pl-PL"/>
+        </w:rPr>
         <w:t>Co zadziałało i gdzie, co się nie zmieniło i dlaczego.</w:t>
       </w:r>
     </w:p>
@@ -1561,8 +2970,14 @@
           <w:ilvl w:val="0"/>
           <w:numId w:val="13"/>
         </w:numPr>
-      </w:pPr>
-      <w:r>
+        <w:rPr>
+          <w:lang w:val="pl-PL"/>
+        </w:rPr>
+      </w:pPr>
+      <w:r>
+        <w:rPr>
+          <w:lang w:val="pl-PL"/>
+        </w:rPr>
         <w:t>Rekomendacje na kolejny rok, w tym co firma może prowadzić sama.</w:t>
       </w:r>
     </w:p>
@@ -1573,9 +2988,14 @@
           <w:ilvl w:val="0"/>
           <w:numId w:val="13"/>
         </w:numPr>
-      </w:pPr>
-      <w:r>
-        <w:lastRenderedPageBreak/>
+        <w:rPr>
+          <w:lang w:val="pl-PL"/>
+        </w:rPr>
+      </w:pPr>
+      <w:r>
+        <w:rPr>
+          <w:lang w:val="pl-PL"/>
+        </w:rPr>
         <w:t>Dane do raportowania ESG, jeśli są potrzebne.</w:t>
       </w:r>
     </w:p>
@@ -1586,8 +3006,14 @@
           <w:ilvl w:val="0"/>
           <w:numId w:val="13"/>
         </w:numPr>
-      </w:pPr>
-      <w:r>
+        <w:rPr>
+          <w:lang w:val="pl-PL"/>
+        </w:rPr>
+      </w:pPr>
+      <w:r>
+        <w:rPr>
+          <w:lang w:val="pl-PL"/>
+        </w:rPr>
         <w:t>Spotkanie z zarządem i komunikat do pracowników.</w:t>
       </w:r>
     </w:p>
@@ -1598,52 +3024,164 @@
           <w:ilvl w:val="0"/>
           <w:numId w:val="13"/>
         </w:numPr>
-      </w:pPr>
-      <w:r>
-        <w:t>Opcjonalnie, za zgodą firmy: case study (publikacja, Summit 2027).</w:t>
-      </w:r>
-    </w:p>
-    <w:p>
+        <w:rPr>
+          <w:lang w:val="pl-PL"/>
+        </w:rPr>
+      </w:pPr>
+      <w:r>
+        <w:rPr>
+          <w:lang w:val="pl-PL"/>
+        </w:rPr>
+        <w:t xml:space="preserve">Opcjonalnie, za zgodą firmy: </w:t>
+      </w:r>
+      <w:proofErr w:type="spellStart"/>
+      <w:r>
+        <w:rPr>
+          <w:lang w:val="pl-PL"/>
+        </w:rPr>
+        <w:t>case</w:t>
+      </w:r>
+      <w:proofErr w:type="spellEnd"/>
+      <w:r>
+        <w:rPr>
+          <w:lang w:val="pl-PL"/>
+        </w:rPr>
+        <w:t xml:space="preserve"> </w:t>
+      </w:r>
+      <w:proofErr w:type="spellStart"/>
+      <w:r>
+        <w:rPr>
+          <w:lang w:val="pl-PL"/>
+        </w:rPr>
+        <w:t>study</w:t>
+      </w:r>
+      <w:proofErr w:type="spellEnd"/>
+      <w:r>
+        <w:rPr>
+          <w:lang w:val="pl-PL"/>
+        </w:rPr>
+        <w:t xml:space="preserve"> (publikacja, </w:t>
+      </w:r>
+      <w:proofErr w:type="spellStart"/>
+      <w:r>
+        <w:rPr>
+          <w:lang w:val="pl-PL"/>
+        </w:rPr>
+        <w:t>Summit</w:t>
+      </w:r>
+      <w:proofErr w:type="spellEnd"/>
+      <w:r>
+        <w:rPr>
+          <w:lang w:val="pl-PL"/>
+        </w:rPr>
+        <w:t xml:space="preserve"> 2027).</w:t>
+      </w:r>
+    </w:p>
+    <w:p>
+      <w:pPr>
+        <w:rPr>
+          <w:lang w:val="pl-PL"/>
+        </w:rPr>
+      </w:pPr>
       <w:r>
         <w:rPr>
           <w:b/>
+          <w:lang w:val="pl-PL"/>
         </w:rPr>
         <w:t>Rezultat:</w:t>
       </w:r>
       <w:r>
+        <w:rPr>
+          <w:lang w:val="pl-PL"/>
+        </w:rPr>
         <w:t xml:space="preserve"> decyzja o kontynuacji; zanonimizowane dane zasilają rozwój Kalkulatora.</w:t>
       </w:r>
     </w:p>
     <w:p>
+      <w:pPr>
+        <w:rPr>
+          <w:lang w:val="pl-PL"/>
+        </w:rPr>
+      </w:pPr>
       <w:r>
         <w:rPr>
           <w:b/>
+          <w:lang w:val="pl-PL"/>
         </w:rPr>
         <w:t>Plus:</w:t>
       </w:r>
       <w:r>
+        <w:rPr>
+          <w:lang w:val="pl-PL"/>
+        </w:rPr>
         <w:t xml:space="preserve"> domyka sprzedaż kolejnego roku i buduje bazę dowodów fundacji. </w:t>
       </w:r>
       <w:r>
         <w:rPr>
           <w:b/>
+          <w:lang w:val="pl-PL"/>
         </w:rPr>
         <w:t>Minus:</w:t>
       </w:r>
       <w:r>
-        <w:t xml:space="preserve"> przy słabym wyniku case study nie powstanie.</w:t>
+        <w:rPr>
+          <w:lang w:val="pl-PL"/>
+        </w:rPr>
+        <w:t xml:space="preserve"> przy słabym wyniku </w:t>
+      </w:r>
+      <w:proofErr w:type="spellStart"/>
+      <w:r>
+        <w:rPr>
+          <w:lang w:val="pl-PL"/>
+        </w:rPr>
+        <w:t>case</w:t>
+      </w:r>
+      <w:proofErr w:type="spellEnd"/>
+      <w:r>
+        <w:rPr>
+          <w:lang w:val="pl-PL"/>
+        </w:rPr>
+        <w:t xml:space="preserve"> </w:t>
+      </w:r>
+      <w:proofErr w:type="spellStart"/>
+      <w:r>
+        <w:rPr>
+          <w:lang w:val="pl-PL"/>
+        </w:rPr>
+        <w:t>study</w:t>
+      </w:r>
+      <w:proofErr w:type="spellEnd"/>
+      <w:r>
+        <w:rPr>
+          <w:lang w:val="pl-PL"/>
+        </w:rPr>
+        <w:t xml:space="preserve"> nie powstanie.</w:t>
       </w:r>
     </w:p>
     <w:p>
       <w:pPr>
         <w:pStyle w:val="Nagwek2"/>
-      </w:pPr>
-      <w:r>
+        <w:rPr>
+          <w:lang w:val="pl-PL"/>
+        </w:rPr>
+      </w:pPr>
+      <w:r>
+        <w:rPr>
+          <w:lang w:val="pl-PL"/>
+        </w:rPr>
         <w:t>Przewagi wobec rynku</w:t>
       </w:r>
     </w:p>
     <w:p>
-      <w:r>
+      <w:pPr>
+        <w:rPr>
+          <w:lang w:val="pl-PL"/>
+        </w:rPr>
+      </w:pPr>
+      <w:r>
+        <w:rPr>
+          <w:lang w:val="pl-PL"/>
+        </w:rPr>
         <w:t>Najtrwalsza przewaga to neutralność fundacji; pozostałe da się z czasem skopiować, więc trzeba je wykorzystać, póki okno jest otwarte.</w:t>
       </w:r>
     </w:p>
@@ -1669,9 +3207,11 @@
             <w:shd w:val="clear" w:color="auto" w:fill="F2F2F2"/>
           </w:tcPr>
           <w:p>
+            <w:proofErr w:type="spellStart"/>
             <w:r>
               <w:t>Przewaga</w:t>
             </w:r>
+            <w:proofErr w:type="spellEnd"/>
           </w:p>
         </w:tc>
         <w:tc>
@@ -1681,8 +3221,21 @@
           </w:tcPr>
           <w:p>
             <w:r>
-              <w:t>Na czym polega</w:t>
-            </w:r>
+              <w:t xml:space="preserve">Na </w:t>
+            </w:r>
+            <w:proofErr w:type="spellStart"/>
+            <w:r>
+              <w:t>czym</w:t>
+            </w:r>
+            <w:proofErr w:type="spellEnd"/>
+            <w:r>
+              <w:t xml:space="preserve"> </w:t>
+            </w:r>
+            <w:proofErr w:type="spellStart"/>
+            <w:r>
+              <w:t>polega</w:t>
+            </w:r>
+            <w:proofErr w:type="spellEnd"/>
           </w:p>
         </w:tc>
         <w:tc>
@@ -1692,8 +3245,21 @@
           </w:tcPr>
           <w:p>
             <w:r>
-              <w:t>Jak trudno skopiować</w:t>
-            </w:r>
+              <w:t xml:space="preserve">Jak </w:t>
+            </w:r>
+            <w:proofErr w:type="spellStart"/>
+            <w:r>
+              <w:t>trudno</w:t>
+            </w:r>
+            <w:proofErr w:type="spellEnd"/>
+            <w:r>
+              <w:t xml:space="preserve"> </w:t>
+            </w:r>
+            <w:proofErr w:type="spellStart"/>
+            <w:r>
+              <w:t>skopiować</w:t>
+            </w:r>
+            <w:proofErr w:type="spellEnd"/>
           </w:p>
         </w:tc>
       </w:tr>
@@ -1703,20 +3269,44 @@
             <w:tcW w:w="3120" w:type="dxa"/>
           </w:tcPr>
           <w:p>
+            <w:proofErr w:type="spellStart"/>
             <w:r>
               <w:rPr>
                 <w:b/>
               </w:rPr>
-              <w:t>Neutralność fundacji</w:t>
-            </w:r>
-          </w:p>
-        </w:tc>
-        <w:tc>
-          <w:tcPr>
-            <w:tcW w:w="3120" w:type="dxa"/>
-          </w:tcPr>
-          <w:p>
-            <w:r>
+              <w:t>Neutralność</w:t>
+            </w:r>
+            <w:proofErr w:type="spellEnd"/>
+            <w:r>
+              <w:rPr>
+                <w:b/>
+              </w:rPr>
+              <w:t xml:space="preserve"> </w:t>
+            </w:r>
+            <w:proofErr w:type="spellStart"/>
+            <w:r>
+              <w:rPr>
+                <w:b/>
+              </w:rPr>
+              <w:t>fundacji</w:t>
+            </w:r>
+            <w:proofErr w:type="spellEnd"/>
+          </w:p>
+        </w:tc>
+        <w:tc>
+          <w:tcPr>
+            <w:tcW w:w="3120" w:type="dxa"/>
+          </w:tcPr>
+          <w:p>
+            <w:pPr>
+              <w:rPr>
+                <w:lang w:val="pl-PL"/>
+              </w:rPr>
+            </w:pPr>
+            <w:r>
+              <w:rPr>
+                <w:lang w:val="pl-PL"/>
+              </w:rPr>
               <w:t>Odpowiedzi pracowników trafiają do fundacji, nie do pracodawcy ani dostawcy wynajętego przez HR</w:t>
             </w:r>
           </w:p>
@@ -1726,7 +3316,15 @@
             <w:tcW w:w="3120" w:type="dxa"/>
           </w:tcPr>
           <w:p>
-            <w:r>
+            <w:pPr>
+              <w:rPr>
+                <w:lang w:val="pl-PL"/>
+              </w:rPr>
+            </w:pPr>
+            <w:r>
+              <w:rPr>
+                <w:lang w:val="pl-PL"/>
+              </w:rPr>
               <w:t>Trudno: wymaga statusu i wiarygodności, nie tylko narzędzia</w:t>
             </w:r>
           </w:p>
@@ -1751,7 +3349,15 @@
             <w:tcW w:w="3120" w:type="dxa"/>
           </w:tcPr>
           <w:p>
-            <w:r>
+            <w:pPr>
+              <w:rPr>
+                <w:lang w:val="pl-PL"/>
+              </w:rPr>
+            </w:pPr>
+            <w:r>
+              <w:rPr>
+                <w:lang w:val="pl-PL"/>
+              </w:rPr>
               <w:t>Wynik firmy na tle reprezentatywnej próby Polaków</w:t>
             </w:r>
           </w:p>
@@ -1761,7 +3367,15 @@
             <w:tcW w:w="3120" w:type="dxa"/>
           </w:tcPr>
           <w:p>
-            <w:r>
+            <w:pPr>
+              <w:rPr>
+                <w:lang w:val="pl-PL"/>
+              </w:rPr>
+            </w:pPr>
+            <w:r>
+              <w:rPr>
+                <w:lang w:val="pl-PL"/>
+              </w:rPr>
               <w:t>Średnio: konkurent musiałby zlecić własne badanie</w:t>
             </w:r>
           </w:p>
@@ -1777,16 +3391,46 @@
               <w:rPr>
                 <w:b/>
               </w:rPr>
-              <w:t>Polska warstwa kulturowa</w:t>
-            </w:r>
-          </w:p>
-        </w:tc>
-        <w:tc>
-          <w:tcPr>
-            <w:tcW w:w="3120" w:type="dxa"/>
-          </w:tcPr>
-          <w:p>
-            <w:r>
+              <w:t xml:space="preserve">Polska </w:t>
+            </w:r>
+            <w:proofErr w:type="spellStart"/>
+            <w:r>
+              <w:rPr>
+                <w:b/>
+              </w:rPr>
+              <w:t>warstwa</w:t>
+            </w:r>
+            <w:proofErr w:type="spellEnd"/>
+            <w:r>
+              <w:rPr>
+                <w:b/>
+              </w:rPr>
+              <w:t xml:space="preserve"> </w:t>
+            </w:r>
+            <w:proofErr w:type="spellStart"/>
+            <w:r>
+              <w:rPr>
+                <w:b/>
+              </w:rPr>
+              <w:t>kulturowa</w:t>
+            </w:r>
+            <w:proofErr w:type="spellEnd"/>
+          </w:p>
+        </w:tc>
+        <w:tc>
+          <w:tcPr>
+            <w:tcW w:w="3120" w:type="dxa"/>
+          </w:tcPr>
+          <w:p>
+            <w:pPr>
+              <w:rPr>
+                <w:lang w:val="pl-PL"/>
+              </w:rPr>
+            </w:pPr>
+            <w:r>
+              <w:rPr>
+                <w:lang w:val="pl-PL"/>
+              </w:rPr>
               <w:t>Folwark, „donosicielstwo”, kultura wstydu; tego nie mają narzędzia importowane</w:t>
             </w:r>
           </w:p>
@@ -1796,9 +3440,11 @@
             <w:tcW w:w="3120" w:type="dxa"/>
           </w:tcPr>
           <w:p>
+            <w:proofErr w:type="spellStart"/>
             <w:r>
               <w:t>Średnio</w:t>
             </w:r>
+            <w:proofErr w:type="spellEnd"/>
           </w:p>
         </w:tc>
       </w:tr>
@@ -1808,9 +3454,15 @@
             <w:tcW w:w="3120" w:type="dxa"/>
           </w:tcPr>
           <w:p>
+            <w:pPr>
+              <w:rPr>
+                <w:lang w:val="pl-PL"/>
+              </w:rPr>
+            </w:pPr>
             <w:r>
               <w:rPr>
                 <w:b/>
+                <w:lang w:val="pl-PL"/>
               </w:rPr>
               <w:t>Pomiar połączony z danymi operacyjnymi</w:t>
             </w:r>
@@ -1821,26 +3473,37 @@
             <w:tcW w:w="3120" w:type="dxa"/>
           </w:tcPr>
           <w:p>
-            <w:r>
+            <w:pPr>
+              <w:rPr>
+                <w:lang w:val="pl-PL"/>
+              </w:rPr>
+            </w:pPr>
+            <w:r>
+              <w:rPr>
+                <w:lang w:val="pl-PL"/>
+              </w:rPr>
               <w:t>Kalkulator zestawia BP z rotacją, absencją, zgłoszeniami w danej firmie</w:t>
             </w:r>
           </w:p>
           <w:p>
             <w:pPr>
               <w:rPr>
-                <w:ins w:id="9033" w:author="Paweł Mamcarz" w:date="2026-10-03T12:00:00Z"/>
-              </w:rPr>
-            </w:pPr>
-            <w:ins w:id="9034" w:author="Paweł Mamcarz" w:date="2026-10-03T12:00:00Z">
+                <w:lang w:val="pl-PL"/>
+              </w:rPr>
+            </w:pPr>
+            <w:ins w:id="2" w:author="Paweł Mamcarz" w:date="2026-10-03T12:00:00Z">
               <w:r>
                 <w:rPr>
                   <w:b/>
+                  <w:lang w:val="pl-PL"/>
                 </w:rPr>
                 <w:t xml:space="preserve">Uwaga Pawła: </w:t>
               </w:r>
               <w:r>
-                <w:rPr/>
-                <w:t xml:space="preserve">to cel, nie stan dzisiejszy. Dziś Kalkulator nie zestawia ankiety z danymi firmy.</w:t>
+                <w:rPr>
+                  <w:lang w:val="pl-PL"/>
+                </w:rPr>
+                <w:t>to cel, nie stan dzisiejszy. Dziś Kalkulator nie zestawia ankiety z danymi firmy.</w:t>
               </w:r>
             </w:ins>
           </w:p>
@@ -1850,7 +3513,15 @@
             <w:tcW w:w="3120" w:type="dxa"/>
           </w:tcPr>
           <w:p>
-            <w:r>
+            <w:pPr>
+              <w:rPr>
+                <w:lang w:val="pl-PL"/>
+              </w:rPr>
+            </w:pPr>
+            <w:r>
+              <w:rPr>
+                <w:lang w:val="pl-PL"/>
+              </w:rPr>
               <w:t>Na dziś brak konkurencji w Polsce</w:t>
             </w:r>
           </w:p>
@@ -1862,10 +3533,17 @@
             <w:tcW w:w="3120" w:type="dxa"/>
           </w:tcPr>
           <w:p>
+            <w:pPr>
+              <w:rPr>
+                <w:lang w:val="pl-PL"/>
+              </w:rPr>
+            </w:pPr>
             <w:r>
               <w:rPr>
                 <w:b/>
-              </w:rPr>
+                <w:lang w:val="pl-PL"/>
+              </w:rPr>
+              <w:lastRenderedPageBreak/>
               <w:t>Dwa wymiary: psychologiczny i systemowy</w:t>
             </w:r>
           </w:p>
@@ -1875,7 +3553,15 @@
             <w:tcW w:w="3120" w:type="dxa"/>
           </w:tcPr>
           <w:p>
-            <w:r>
+            <w:pPr>
+              <w:rPr>
+                <w:lang w:val="pl-PL"/>
+              </w:rPr>
+            </w:pPr>
+            <w:r>
+              <w:rPr>
+                <w:lang w:val="pl-PL"/>
+              </w:rPr>
               <w:t>Badania zaangażowania zwykle nie sprawdzają, czy ludzie wierzą w procedury</w:t>
             </w:r>
           </w:p>
@@ -1885,7 +3571,15 @@
             <w:tcW w:w="3120" w:type="dxa"/>
           </w:tcPr>
           <w:p>
-            <w:r>
+            <w:pPr>
+              <w:rPr>
+                <w:lang w:val="pl-PL"/>
+              </w:rPr>
+            </w:pPr>
+            <w:r>
+              <w:rPr>
+                <w:lang w:val="pl-PL"/>
+              </w:rPr>
               <w:t>Łatwo, ale nikt tego nie robi w jednym modelu</w:t>
             </w:r>
           </w:p>
@@ -1897,9 +3591,15 @@
             <w:tcW w:w="3120" w:type="dxa"/>
           </w:tcPr>
           <w:p>
+            <w:pPr>
+              <w:rPr>
+                <w:lang w:val="pl-PL"/>
+              </w:rPr>
+            </w:pPr>
             <w:r>
               <w:rPr>
                 <w:b/>
+                <w:lang w:val="pl-PL"/>
               </w:rPr>
               <w:t>Zmiana postaw zamiast szkoleń z narzędzi</w:t>
             </w:r>
@@ -1910,7 +3610,15 @@
             <w:tcW w:w="3120" w:type="dxa"/>
           </w:tcPr>
           <w:p>
-            <w:r>
+            <w:pPr>
+              <w:rPr>
+                <w:lang w:val="pl-PL"/>
+              </w:rPr>
+            </w:pPr>
+            <w:r>
+              <w:rPr>
+                <w:lang w:val="pl-PL"/>
+              </w:rPr>
               <w:t>Zarząd w programie, praktyka między sesjami, ponowny pomiar</w:t>
             </w:r>
           </w:p>
@@ -1920,7 +3628,15 @@
             <w:tcW w:w="3120" w:type="dxa"/>
           </w:tcPr>
           <w:p>
-            <w:r>
+            <w:pPr>
+              <w:rPr>
+                <w:lang w:val="pl-PL"/>
+              </w:rPr>
+            </w:pPr>
+            <w:r>
+              <w:rPr>
+                <w:lang w:val="pl-PL"/>
+              </w:rPr>
               <w:t>Średnio: wymaga metodyki i ludzi</w:t>
             </w:r>
           </w:p>
@@ -1932,9 +3648,15 @@
             <w:tcW w:w="3120" w:type="dxa"/>
           </w:tcPr>
           <w:p>
+            <w:pPr>
+              <w:rPr>
+                <w:lang w:val="pl-PL"/>
+              </w:rPr>
+            </w:pPr>
             <w:r>
               <w:rPr>
                 <w:b/>
+                <w:lang w:val="pl-PL"/>
               </w:rPr>
               <w:t>Rozmowa na poziomie zarządu i ryzyka</w:t>
             </w:r>
@@ -1945,7 +3667,15 @@
             <w:tcW w:w="3120" w:type="dxa"/>
           </w:tcPr>
           <w:p>
-            <w:r>
+            <w:pPr>
+              <w:rPr>
+                <w:lang w:val="pl-PL"/>
+              </w:rPr>
+            </w:pPr>
+            <w:r>
+              <w:rPr>
+                <w:lang w:val="pl-PL"/>
+              </w:rPr>
               <w:t>Temat poza „miękkim HR”, z hakami regulacyjnymi</w:t>
             </w:r>
           </w:p>
@@ -1955,7 +3685,15 @@
             <w:tcW w:w="3120" w:type="dxa"/>
           </w:tcPr>
           <w:p>
-            <w:r>
+            <w:pPr>
+              <w:rPr>
+                <w:lang w:val="pl-PL"/>
+              </w:rPr>
+            </w:pPr>
+            <w:r>
+              <w:rPr>
+                <w:lang w:val="pl-PL"/>
+              </w:rPr>
               <w:t>Łatwo w deklaracji, trudno w praktyce</w:t>
             </w:r>
           </w:p>
@@ -1967,20 +3705,72 @@
             <w:tcW w:w="3120" w:type="dxa"/>
           </w:tcPr>
           <w:p>
+            <w:proofErr w:type="spellStart"/>
             <w:r>
               <w:rPr>
                 <w:b/>
               </w:rPr>
-              <w:t>Pierwszeństwo i zasięg medialny</w:t>
-            </w:r>
-          </w:p>
-        </w:tc>
-        <w:tc>
-          <w:tcPr>
-            <w:tcW w:w="3120" w:type="dxa"/>
-          </w:tcPr>
-          <w:p>
-            <w:r>
+              <w:t>Pierwszeństwo</w:t>
+            </w:r>
+            <w:proofErr w:type="spellEnd"/>
+            <w:r>
+              <w:rPr>
+                <w:b/>
+              </w:rPr>
+              <w:t xml:space="preserve"> </w:t>
+            </w:r>
+            <w:proofErr w:type="spellStart"/>
+            <w:r>
+              <w:rPr>
+                <w:b/>
+              </w:rPr>
+              <w:t>i</w:t>
+            </w:r>
+            <w:proofErr w:type="spellEnd"/>
+            <w:r>
+              <w:rPr>
+                <w:b/>
+              </w:rPr>
+              <w:t xml:space="preserve"> </w:t>
+            </w:r>
+            <w:proofErr w:type="spellStart"/>
+            <w:r>
+              <w:rPr>
+                <w:b/>
+              </w:rPr>
+              <w:t>zasięg</w:t>
+            </w:r>
+            <w:proofErr w:type="spellEnd"/>
+            <w:r>
+              <w:rPr>
+                <w:b/>
+              </w:rPr>
+              <w:t xml:space="preserve"> </w:t>
+            </w:r>
+            <w:proofErr w:type="spellStart"/>
+            <w:r>
+              <w:rPr>
+                <w:b/>
+              </w:rPr>
+              <w:t>medialny</w:t>
+            </w:r>
+            <w:proofErr w:type="spellEnd"/>
+          </w:p>
+        </w:tc>
+        <w:tc>
+          <w:tcPr>
+            <w:tcW w:w="3120" w:type="dxa"/>
+          </w:tcPr>
+          <w:p>
+            <w:pPr>
+              <w:rPr>
+                <w:lang w:val="pl-PL"/>
+              </w:rPr>
+            </w:pPr>
+            <w:r>
+              <w:rPr>
+                <w:lang w:val="pl-PL"/>
+              </w:rPr>
               <w:t>Dwa raporty, dwie konferencje, kampania, publikacje w mediach ogólnopolskich</w:t>
             </w:r>
           </w:p>
@@ -1990,7 +3780,15 @@
             <w:tcW w:w="3120" w:type="dxa"/>
           </w:tcPr>
           <w:p>
-            <w:r>
+            <w:pPr>
+              <w:rPr>
+                <w:lang w:val="pl-PL"/>
+              </w:rPr>
+            </w:pPr>
+            <w:r>
+              <w:rPr>
+                <w:lang w:val="pl-PL"/>
+              </w:rPr>
               <w:t>Przewaga czasowa, słabnie z każdym rokiem</w:t>
             </w:r>
           </w:p>
@@ -2000,14 +3798,27 @@
     <w:p>
       <w:pPr>
         <w:pStyle w:val="Nagwek2"/>
-      </w:pPr>
-      <w:r>
-        <w:lastRenderedPageBreak/>
+        <w:rPr>
+          <w:lang w:val="pl-PL"/>
+        </w:rPr>
+      </w:pPr>
+      <w:r>
+        <w:rPr>
+          <w:lang w:val="pl-PL"/>
+        </w:rPr>
         <w:t>Plusy i minusy podejścia</w:t>
       </w:r>
     </w:p>
     <w:p>
-      <w:r>
+      <w:pPr>
+        <w:rPr>
+          <w:lang w:val="pl-PL"/>
+        </w:rPr>
+      </w:pPr>
+      <w:r>
+        <w:rPr>
+          <w:lang w:val="pl-PL"/>
+        </w:rPr>
         <w:t>Podejście jest spójne z uczciwym pozycjonowaniem fundacji, ale ma długi cykl sprzedaży i wysokie wymagania wykonawcze.</w:t>
       </w:r>
     </w:p>
@@ -2032,9 +3843,11 @@
             <w:shd w:val="clear" w:color="auto" w:fill="F2F2F2"/>
           </w:tcPr>
           <w:p>
+            <w:proofErr w:type="spellStart"/>
             <w:r>
               <w:t>Plusy</w:t>
             </w:r>
+            <w:proofErr w:type="spellEnd"/>
           </w:p>
         </w:tc>
         <w:tc>
@@ -2043,9 +3856,11 @@
             <w:shd w:val="clear" w:color="auto" w:fill="F2F2F2"/>
           </w:tcPr>
           <w:p>
+            <w:proofErr w:type="spellStart"/>
             <w:r>
               <w:t>Minusy</w:t>
             </w:r>
+            <w:proofErr w:type="spellEnd"/>
           </w:p>
         </w:tc>
       </w:tr>
@@ -2055,7 +3870,15 @@
             <w:tcW w:w="4680" w:type="dxa"/>
           </w:tcPr>
           <w:p>
-            <w:r>
+            <w:pPr>
+              <w:rPr>
+                <w:lang w:val="pl-PL"/>
+              </w:rPr>
+            </w:pPr>
+            <w:r>
+              <w:rPr>
+                <w:lang w:val="pl-PL"/>
+              </w:rPr>
               <w:t>Logika „zmierz, działaj, zmierz ponownie” zrozumiała dla zarządu</w:t>
             </w:r>
           </w:p>
@@ -2065,7 +3888,15 @@
             <w:tcW w:w="4680" w:type="dxa"/>
           </w:tcPr>
           <w:p>
-            <w:r>
+            <w:pPr>
+              <w:rPr>
+                <w:lang w:val="pl-PL"/>
+              </w:rPr>
+            </w:pPr>
+            <w:r>
+              <w:rPr>
+                <w:lang w:val="pl-PL"/>
+              </w:rPr>
               <w:t>Długi cykl: od pierwszego kontaktu do wyniku mija ponad rok</w:t>
             </w:r>
           </w:p>
@@ -2077,7 +3908,15 @@
             <w:tcW w:w="4680" w:type="dxa"/>
           </w:tcPr>
           <w:p>
-            <w:r>
+            <w:pPr>
+              <w:rPr>
+                <w:lang w:val="pl-PL"/>
+              </w:rPr>
+            </w:pPr>
+            <w:r>
+              <w:rPr>
+                <w:lang w:val="pl-PL"/>
+              </w:rPr>
               <w:t>Uczciwa obietnica: „sprawdzimy u was”, bez obiecywania ROI</w:t>
             </w:r>
           </w:p>
@@ -2087,7 +3926,15 @@
             <w:tcW w:w="4680" w:type="dxa"/>
           </w:tcPr>
           <w:p>
-            <w:r>
+            <w:pPr>
+              <w:rPr>
+                <w:lang w:val="pl-PL"/>
+              </w:rPr>
+            </w:pPr>
+            <w:r>
+              <w:rPr>
+                <w:lang w:val="pl-PL"/>
+              </w:rPr>
               <w:t>Brak twardej obietnicy efektu utrudnia sprzedaż firmom nastawionym na szybki zwrot</w:t>
             </w:r>
           </w:p>
@@ -2099,7 +3946,15 @@
             <w:tcW w:w="4680" w:type="dxa"/>
           </w:tcPr>
           <w:p>
-            <w:r>
+            <w:pPr>
+              <w:rPr>
+                <w:lang w:val="pl-PL"/>
+              </w:rPr>
+            </w:pPr>
+            <w:r>
+              <w:rPr>
+                <w:lang w:val="pl-PL"/>
+              </w:rPr>
               <w:t>Dwa etapy umowy obniżają próg wejścia</w:t>
             </w:r>
           </w:p>
@@ -2109,7 +3964,15 @@
             <w:tcW w:w="4680" w:type="dxa"/>
           </w:tcPr>
           <w:p>
-            <w:r>
+            <w:pPr>
+              <w:rPr>
+                <w:lang w:val="pl-PL"/>
+              </w:rPr>
+            </w:pPr>
+            <w:r>
+              <w:rPr>
+                <w:lang w:val="pl-PL"/>
+              </w:rPr>
               <w:t>Część klientów zatrzyma się po diagnozie</w:t>
             </w:r>
           </w:p>
@@ -2121,7 +3984,15 @@
             <w:tcW w:w="4680" w:type="dxa"/>
           </w:tcPr>
           <w:p>
-            <w:r>
+            <w:pPr>
+              <w:rPr>
+                <w:lang w:val="pl-PL"/>
+              </w:rPr>
+            </w:pPr>
+            <w:r>
+              <w:rPr>
+                <w:lang w:val="pl-PL"/>
+              </w:rPr>
               <w:t>Diagnoza zarabia sama, nawet bez etapu 2</w:t>
             </w:r>
           </w:p>
@@ -2131,7 +4002,15 @@
             <w:tcW w:w="4680" w:type="dxa"/>
           </w:tcPr>
           <w:p>
-            <w:r>
+            <w:pPr>
+              <w:rPr>
+                <w:lang w:val="pl-PL"/>
+              </w:rPr>
+            </w:pPr>
+            <w:r>
+              <w:rPr>
+                <w:lang w:val="pl-PL"/>
+              </w:rPr>
               <w:t>Etap 2 (działania) jest najdroższy w realizacji i najtrudniejszy do skalowania</w:t>
             </w:r>
           </w:p>
@@ -2143,7 +4022,15 @@
             <w:tcW w:w="4680" w:type="dxa"/>
           </w:tcPr>
           <w:p>
-            <w:r>
+            <w:pPr>
+              <w:rPr>
+                <w:lang w:val="pl-PL"/>
+              </w:rPr>
+            </w:pPr>
+            <w:r>
+              <w:rPr>
+                <w:lang w:val="pl-PL"/>
+              </w:rPr>
               <w:t>Każdy klient dostarcza dane do Kalkulatora i buduje dowody dla fundacji</w:t>
             </w:r>
           </w:p>
@@ -2153,7 +4040,15 @@
             <w:tcW w:w="4680" w:type="dxa"/>
           </w:tcPr>
           <w:p>
-            <w:r>
+            <w:pPr>
+              <w:rPr>
+                <w:lang w:val="pl-PL"/>
+              </w:rPr>
+            </w:pPr>
+            <w:r>
+              <w:rPr>
+                <w:lang w:val="pl-PL"/>
+              </w:rPr>
               <w:t>Jakość danych zależy od klienta; w wielu firmach będą słabe</w:t>
             </w:r>
           </w:p>
@@ -2165,7 +4060,15 @@
             <w:tcW w:w="4680" w:type="dxa"/>
           </w:tcPr>
           <w:p>
-            <w:r>
+            <w:pPr>
+              <w:rPr>
+                <w:lang w:val="pl-PL"/>
+              </w:rPr>
+            </w:pPr>
+            <w:r>
+              <w:rPr>
+                <w:lang w:val="pl-PL"/>
+              </w:rPr>
               <w:t>Zarząd w programie zwiększa szansę na realną zmianę</w:t>
             </w:r>
           </w:p>
@@ -2175,7 +4078,15 @@
             <w:tcW w:w="4680" w:type="dxa"/>
           </w:tcPr>
           <w:p>
-            <w:r>
+            <w:pPr>
+              <w:rPr>
+                <w:lang w:val="pl-PL"/>
+              </w:rPr>
+            </w:pPr>
+            <w:r>
+              <w:rPr>
+                <w:lang w:val="pl-PL"/>
+              </w:rPr>
               <w:t>Wymóg udziału zarządu zawęża grupę firm, które się zdecydują</w:t>
             </w:r>
           </w:p>
@@ -2187,7 +4098,15 @@
             <w:tcW w:w="4680" w:type="dxa"/>
           </w:tcPr>
           <w:p>
-            <w:r>
+            <w:pPr>
+              <w:rPr>
+                <w:lang w:val="pl-PL"/>
+              </w:rPr>
+            </w:pPr>
+            <w:r>
+              <w:rPr>
+                <w:lang w:val="pl-PL"/>
+              </w:rPr>
               <w:t>Powrót wyników do zespołów buduje zaufanie i chroni ponowny pomiar</w:t>
             </w:r>
           </w:p>
@@ -2197,7 +4116,15 @@
             <w:tcW w:w="4680" w:type="dxa"/>
           </w:tcPr>
           <w:p>
-            <w:r>
+            <w:pPr>
+              <w:rPr>
+                <w:lang w:val="pl-PL"/>
+              </w:rPr>
+            </w:pPr>
+            <w:r>
+              <w:rPr>
+                <w:lang w:val="pl-PL"/>
+              </w:rPr>
               <w:t>Wymaga czasu liderów i odwagi zarządu</w:t>
             </w:r>
           </w:p>
@@ -2209,8 +4136,30 @@
             <w:tcW w:w="4680" w:type="dxa"/>
           </w:tcPr>
           <w:p>
-            <w:r>
-              <w:t>Case study z pomiarem przed i po to najmocniejszy materiał sprzedażowy na kolejne lata</w:t>
+            <w:pPr>
+              <w:rPr>
+                <w:lang w:val="pl-PL"/>
+              </w:rPr>
+            </w:pPr>
+            <w:r>
+              <w:rPr>
+                <w:lang w:val="pl-PL"/>
+              </w:rPr>
+              <w:t xml:space="preserve">Case </w:t>
+            </w:r>
+            <w:proofErr w:type="spellStart"/>
+            <w:r>
+              <w:rPr>
+                <w:lang w:val="pl-PL"/>
+              </w:rPr>
+              <w:t>study</w:t>
+            </w:r>
+            <w:proofErr w:type="spellEnd"/>
+            <w:r>
+              <w:rPr>
+                <w:lang w:val="pl-PL"/>
+              </w:rPr>
+              <w:t xml:space="preserve"> z pomiarem przed i po to najmocniejszy materiał sprzedażowy na kolejne lata</w:t>
             </w:r>
           </w:p>
         </w:tc>
@@ -2219,8 +4168,44 @@
             <w:tcW w:w="4680" w:type="dxa"/>
           </w:tcPr>
           <w:p>
-            <w:r>
-              <w:t>Pierwsze case study powstaną najwcześniej pod koniec 2027</w:t>
+            <w:pPr>
+              <w:rPr>
+                <w:lang w:val="pl-PL"/>
+              </w:rPr>
+            </w:pPr>
+            <w:r>
+              <w:rPr>
+                <w:lang w:val="pl-PL"/>
+              </w:rPr>
+              <w:t xml:space="preserve">Pierwsze </w:t>
+            </w:r>
+            <w:proofErr w:type="spellStart"/>
+            <w:r>
+              <w:rPr>
+                <w:lang w:val="pl-PL"/>
+              </w:rPr>
+              <w:t>case</w:t>
+            </w:r>
+            <w:proofErr w:type="spellEnd"/>
+            <w:r>
+              <w:rPr>
+                <w:lang w:val="pl-PL"/>
+              </w:rPr>
+              <w:t xml:space="preserve"> </w:t>
+            </w:r>
+            <w:proofErr w:type="spellStart"/>
+            <w:r>
+              <w:rPr>
+                <w:lang w:val="pl-PL"/>
+              </w:rPr>
+              <w:t>study</w:t>
+            </w:r>
+            <w:proofErr w:type="spellEnd"/>
+            <w:r>
+              <w:rPr>
+                <w:lang w:val="pl-PL"/>
+              </w:rPr>
+              <w:t xml:space="preserve"> powstaną najwcześniej pod koniec 2027</w:t>
             </w:r>
           </w:p>
         </w:tc>
@@ -2229,13 +4214,28 @@
     <w:p>
       <w:pPr>
         <w:pStyle w:val="Nagwek2"/>
-      </w:pPr>
-      <w:r>
+        <w:rPr>
+          <w:lang w:val="pl-PL"/>
+        </w:rPr>
+      </w:pPr>
+      <w:r>
+        <w:rPr>
+          <w:lang w:val="pl-PL"/>
+        </w:rPr>
+        <w:lastRenderedPageBreak/>
         <w:t>Zagrożenia i jak je ograniczać</w:t>
       </w:r>
     </w:p>
     <w:p>
-      <w:r>
+      <w:pPr>
+        <w:rPr>
+          <w:lang w:val="pl-PL"/>
+        </w:rPr>
+      </w:pPr>
+      <w:r>
+        <w:rPr>
+          <w:lang w:val="pl-PL"/>
+        </w:rPr>
         <w:t>Największe zagrożenia dotyczą wiarygodności: nadmiernej obietnicy w krokach 1 i 4 oraz złego użycia wyników przez zarząd.</w:t>
       </w:r>
     </w:p>
@@ -2261,9 +4261,11 @@
             <w:shd w:val="clear" w:color="auto" w:fill="F2F2F2"/>
           </w:tcPr>
           <w:p>
+            <w:proofErr w:type="spellStart"/>
             <w:r>
               <w:t>Zagrożenie</w:t>
             </w:r>
+            <w:proofErr w:type="spellEnd"/>
           </w:p>
         </w:tc>
         <w:tc>
@@ -2272,9 +4274,27 @@
             <w:shd w:val="clear" w:color="auto" w:fill="F2F2F2"/>
           </w:tcPr>
           <w:p>
-            <w:r>
-              <w:t>Gdzie się pojawia</w:t>
-            </w:r>
+            <w:proofErr w:type="spellStart"/>
+            <w:r>
+              <w:t>Gdzie</w:t>
+            </w:r>
+            <w:proofErr w:type="spellEnd"/>
+            <w:r>
+              <w:t xml:space="preserve"> </w:t>
+            </w:r>
+            <w:proofErr w:type="spellStart"/>
+            <w:r>
+              <w:t>się</w:t>
+            </w:r>
+            <w:proofErr w:type="spellEnd"/>
+            <w:r>
+              <w:t xml:space="preserve"> </w:t>
+            </w:r>
+            <w:proofErr w:type="spellStart"/>
+            <w:r>
+              <w:t>pojawia</w:t>
+            </w:r>
+            <w:proofErr w:type="spellEnd"/>
           </w:p>
         </w:tc>
         <w:tc>
@@ -2284,8 +4304,13 @@
           </w:tcPr>
           <w:p>
             <w:r>
-              <w:t>Jak ograniczyć</w:t>
-            </w:r>
+              <w:t xml:space="preserve">Jak </w:t>
+            </w:r>
+            <w:proofErr w:type="spellStart"/>
+            <w:r>
+              <w:t>ograniczyć</w:t>
+            </w:r>
+            <w:proofErr w:type="spellEnd"/>
           </w:p>
         </w:tc>
       </w:tr>
@@ -2295,7 +4320,15 @@
             <w:tcW w:w="3120" w:type="dxa"/>
           </w:tcPr>
           <w:p>
-            <w:r>
+            <w:pPr>
+              <w:rPr>
+                <w:lang w:val="pl-PL"/>
+              </w:rPr>
+            </w:pPr>
+            <w:r>
+              <w:rPr>
+                <w:lang w:val="pl-PL"/>
+              </w:rPr>
               <w:t>Korelacje z raportu odebrane jako obietnica efektu</w:t>
             </w:r>
           </w:p>
@@ -2315,7 +4348,15 @@
             <w:tcW w:w="3120" w:type="dxa"/>
           </w:tcPr>
           <w:p>
-            <w:r>
+            <w:pPr>
+              <w:rPr>
+                <w:lang w:val="pl-PL"/>
+              </w:rPr>
+            </w:pPr>
+            <w:r>
+              <w:rPr>
+                <w:lang w:val="pl-PL"/>
+              </w:rPr>
               <w:t>Pokazywać jako pytanie; wprost mówić, że raport koreluje deklaracje</w:t>
             </w:r>
           </w:p>
@@ -2327,7 +4368,15 @@
             <w:tcW w:w="3120" w:type="dxa"/>
           </w:tcPr>
           <w:p>
-            <w:r>
+            <w:pPr>
+              <w:rPr>
+                <w:lang w:val="pl-PL"/>
+              </w:rPr>
+            </w:pPr>
+            <w:r>
+              <w:rPr>
+                <w:lang w:val="pl-PL"/>
+              </w:rPr>
               <w:t>Zarząd zakotwiczy się na jednej kwocie z Kalkulatora</w:t>
             </w:r>
           </w:p>
@@ -2347,7 +4396,15 @@
             <w:tcW w:w="3120" w:type="dxa"/>
           </w:tcPr>
           <w:p>
-            <w:r>
+            <w:pPr>
+              <w:rPr>
+                <w:lang w:val="pl-PL"/>
+              </w:rPr>
+            </w:pPr>
+            <w:r>
+              <w:rPr>
+                <w:lang w:val="pl-PL"/>
+              </w:rPr>
               <w:t>Zawsze przedziały, scenariusze i wypisane założenia</w:t>
             </w:r>
           </w:p>
@@ -2359,7 +4416,15 @@
             <w:tcW w:w="3120" w:type="dxa"/>
           </w:tcPr>
           <w:p>
-            <w:r>
+            <w:pPr>
+              <w:rPr>
+                <w:lang w:val="pl-PL"/>
+              </w:rPr>
+            </w:pPr>
+            <w:r>
+              <w:rPr>
+                <w:lang w:val="pl-PL"/>
+              </w:rPr>
               <w:t>Wyniki użyte do rozliczania menedżerów</w:t>
             </w:r>
           </w:p>
@@ -2379,7 +4444,15 @@
             <w:tcW w:w="3120" w:type="dxa"/>
           </w:tcPr>
           <w:p>
-            <w:r>
+            <w:pPr>
+              <w:rPr>
+                <w:lang w:val="pl-PL"/>
+              </w:rPr>
+            </w:pPr>
+            <w:r>
+              <w:rPr>
+                <w:lang w:val="pl-PL"/>
+              </w:rPr>
               <w:t>Zasady użycia wyników zapisane w umowie przed badaniem</w:t>
             </w:r>
           </w:p>
@@ -2391,7 +4464,15 @@
             <w:tcW w:w="3120" w:type="dxa"/>
           </w:tcPr>
           <w:p>
-            <w:r>
+            <w:pPr>
+              <w:rPr>
+                <w:lang w:val="pl-PL"/>
+              </w:rPr>
+            </w:pPr>
+            <w:r>
+              <w:rPr>
+                <w:lang w:val="pl-PL"/>
+              </w:rPr>
               <w:t>Niska frekwencja i nieszczere odpowiedzi (niskie zaufanie)</w:t>
             </w:r>
           </w:p>
@@ -2411,12 +4492,16 @@
             <w:tcW w:w="3120" w:type="dxa"/>
           </w:tcPr>
           <w:p>
-            <w:r>
-              <w:t xml:space="preserve">Komunikat o neutralności fundacji; link na zespół zamiast </w:t>
-            </w:r>
-            <w:r>
-              <w:lastRenderedPageBreak/>
-              <w:t>imiennego</w:t>
+            <w:pPr>
+              <w:rPr>
+                <w:lang w:val="pl-PL"/>
+              </w:rPr>
+            </w:pPr>
+            <w:r>
+              <w:rPr>
+                <w:lang w:val="pl-PL"/>
+              </w:rPr>
+              <w:t>Komunikat o neutralności fundacji; link na zespół zamiast imiennego</w:t>
             </w:r>
           </w:p>
         </w:tc>
@@ -2427,8 +4512,15 @@
             <w:tcW w:w="3120" w:type="dxa"/>
           </w:tcPr>
           <w:p>
-            <w:r>
-              <w:lastRenderedPageBreak/>
+            <w:pPr>
+              <w:rPr>
+                <w:lang w:val="pl-PL"/>
+              </w:rPr>
+            </w:pPr>
+            <w:r>
+              <w:rPr>
+                <w:lang w:val="pl-PL"/>
+              </w:rPr>
               <w:t>Słabe lub brakujące dane HR</w:t>
             </w:r>
           </w:p>
@@ -2448,7 +4540,15 @@
             <w:tcW w:w="3120" w:type="dxa"/>
           </w:tcPr>
           <w:p>
-            <w:r>
+            <w:pPr>
+              <w:rPr>
+                <w:lang w:val="pl-PL"/>
+              </w:rPr>
+            </w:pPr>
+            <w:r>
+              <w:rPr>
+                <w:lang w:val="pl-PL"/>
+              </w:rPr>
               <w:t>Minimalny zestaw danych w umowie; brak danych jako wynik diagnozy</w:t>
             </w:r>
           </w:p>
@@ -2460,7 +4560,15 @@
             <w:tcW w:w="3120" w:type="dxa"/>
           </w:tcPr>
           <w:p>
-            <w:r>
+            <w:pPr>
+              <w:rPr>
+                <w:lang w:val="pl-PL"/>
+              </w:rPr>
+            </w:pPr>
+            <w:r>
+              <w:rPr>
+                <w:lang w:val="pl-PL"/>
+              </w:rPr>
               <w:t>Zarząd chce „naprawić menedżerów”, nie siebie</w:t>
             </w:r>
           </w:p>
@@ -2480,7 +4588,15 @@
             <w:tcW w:w="3120" w:type="dxa"/>
           </w:tcPr>
           <w:p>
-            <w:r>
+            <w:pPr>
+              <w:rPr>
+                <w:lang w:val="pl-PL"/>
+              </w:rPr>
+            </w:pPr>
+            <w:r>
+              <w:rPr>
+                <w:lang w:val="pl-PL"/>
+              </w:rPr>
               <w:t>Udział zarządu jako warunek; „lustro” w diagnozie</w:t>
             </w:r>
           </w:p>
@@ -2492,7 +4608,15 @@
             <w:tcW w:w="3120" w:type="dxa"/>
           </w:tcPr>
           <w:p>
-            <w:r>
+            <w:pPr>
+              <w:rPr>
+                <w:lang w:val="pl-PL"/>
+              </w:rPr>
+            </w:pPr>
+            <w:r>
+              <w:rPr>
+                <w:lang w:val="pl-PL"/>
+              </w:rPr>
               <w:t>Zmiana postaw bez zmian systemowych prowadzi do cynizmu</w:t>
             </w:r>
           </w:p>
@@ -2512,7 +4636,15 @@
             <w:tcW w:w="3120" w:type="dxa"/>
           </w:tcPr>
           <w:p>
-            <w:r>
+            <w:pPr>
+              <w:rPr>
+                <w:lang w:val="pl-PL"/>
+              </w:rPr>
+            </w:pPr>
+            <w:r>
+              <w:rPr>
+                <w:lang w:val="pl-PL"/>
+              </w:rPr>
               <w:t>Co najmniej jedna zmiana systemowa w każdym planie</w:t>
             </w:r>
           </w:p>
@@ -2524,7 +4656,15 @@
             <w:tcW w:w="3120" w:type="dxa"/>
           </w:tcPr>
           <w:p>
-            <w:r>
+            <w:pPr>
+              <w:rPr>
+                <w:lang w:val="pl-PL"/>
+              </w:rPr>
+            </w:pPr>
+            <w:r>
+              <w:rPr>
+                <w:lang w:val="pl-PL"/>
+              </w:rPr>
               <w:t>Fundacja nie ma ludzi, by dowieźć kilka programów naraz</w:t>
             </w:r>
           </w:p>
@@ -2544,8 +4684,30 @@
             <w:tcW w:w="3120" w:type="dxa"/>
           </w:tcPr>
           <w:p>
-            <w:r>
-              <w:t>Pula facylitatorów pracujących wg jednego standardu; limit klientów równolegle</w:t>
+            <w:pPr>
+              <w:rPr>
+                <w:lang w:val="pl-PL"/>
+              </w:rPr>
+            </w:pPr>
+            <w:r>
+              <w:rPr>
+                <w:lang w:val="pl-PL"/>
+              </w:rPr>
+              <w:t xml:space="preserve">Pula </w:t>
+            </w:r>
+            <w:proofErr w:type="spellStart"/>
+            <w:r>
+              <w:rPr>
+                <w:lang w:val="pl-PL"/>
+              </w:rPr>
+              <w:t>facylitatorów</w:t>
+            </w:r>
+            <w:proofErr w:type="spellEnd"/>
+            <w:r>
+              <w:rPr>
+                <w:lang w:val="pl-PL"/>
+              </w:rPr>
+              <w:t xml:space="preserve"> pracujących wg jednego standardu; limit klientów równolegle</w:t>
             </w:r>
           </w:p>
         </w:tc>
@@ -2556,9 +4718,35 @@
             <w:tcW w:w="3120" w:type="dxa"/>
           </w:tcPr>
           <w:p>
-            <w:r>
-              <w:t>Ponowny pomiar pokazuje spadek</w:t>
-            </w:r>
+            <w:proofErr w:type="spellStart"/>
+            <w:r>
+              <w:t>Ponowny</w:t>
+            </w:r>
+            <w:proofErr w:type="spellEnd"/>
+            <w:r>
+              <w:t xml:space="preserve"> </w:t>
+            </w:r>
+            <w:proofErr w:type="spellStart"/>
+            <w:r>
+              <w:t>pomiar</w:t>
+            </w:r>
+            <w:proofErr w:type="spellEnd"/>
+            <w:r>
+              <w:t xml:space="preserve"> </w:t>
+            </w:r>
+            <w:proofErr w:type="spellStart"/>
+            <w:r>
+              <w:t>pokazuje</w:t>
+            </w:r>
+            <w:proofErr w:type="spellEnd"/>
+            <w:r>
+              <w:t xml:space="preserve"> </w:t>
+            </w:r>
+            <w:proofErr w:type="spellStart"/>
+            <w:r>
+              <w:t>spadek</w:t>
+            </w:r>
+            <w:proofErr w:type="spellEnd"/>
           </w:p>
         </w:tc>
         <w:tc>
@@ -2576,7 +4764,15 @@
             <w:tcW w:w="3120" w:type="dxa"/>
           </w:tcPr>
           <w:p>
-            <w:r>
+            <w:pPr>
+              <w:rPr>
+                <w:lang w:val="pl-PL"/>
+              </w:rPr>
+            </w:pPr>
+            <w:r>
+              <w:rPr>
+                <w:lang w:val="pl-PL"/>
+              </w:rPr>
               <w:t>Uprzedzić w kroku 1; wskaźniki wyprzedzające; porównanie zespołów</w:t>
             </w:r>
           </w:p>
@@ -2588,7 +4784,15 @@
             <w:tcW w:w="3120" w:type="dxa"/>
           </w:tcPr>
           <w:p>
-            <w:r>
+            <w:pPr>
+              <w:rPr>
+                <w:lang w:val="pl-PL"/>
+              </w:rPr>
+            </w:pPr>
+            <w:r>
+              <w:rPr>
+                <w:lang w:val="pl-PL"/>
+              </w:rPr>
               <w:t>Efekt nie do udowodnienia przyczynowo</w:t>
             </w:r>
           </w:p>
@@ -2608,7 +4812,15 @@
             <w:tcW w:w="3120" w:type="dxa"/>
           </w:tcPr>
           <w:p>
-            <w:r>
+            <w:pPr>
+              <w:rPr>
+                <w:lang w:val="pl-PL"/>
+              </w:rPr>
+            </w:pPr>
+            <w:r>
+              <w:rPr>
+                <w:lang w:val="pl-PL"/>
+              </w:rPr>
               <w:t>Uczciwy język wniosków: „zbiegło się z”, nie „spowodowało”</w:t>
             </w:r>
           </w:p>
@@ -2620,7 +4832,15 @@
             <w:tcW w:w="3120" w:type="dxa"/>
           </w:tcPr>
           <w:p>
-            <w:r>
+            <w:pPr>
+              <w:rPr>
+                <w:lang w:val="pl-PL"/>
+              </w:rPr>
+            </w:pPr>
+            <w:r>
+              <w:rPr>
+                <w:lang w:val="pl-PL"/>
+              </w:rPr>
               <w:t>Zarzut konfliktu: fundacja diagnozuje i sprzedaje działania</w:t>
             </w:r>
           </w:p>
@@ -2640,7 +4860,15 @@
             <w:tcW w:w="3120" w:type="dxa"/>
           </w:tcPr>
           <w:p>
-            <w:r>
+            <w:pPr>
+              <w:rPr>
+                <w:lang w:val="pl-PL"/>
+              </w:rPr>
+            </w:pPr>
+            <w:r>
+              <w:rPr>
+                <w:lang w:val="pl-PL"/>
+              </w:rPr>
               <w:t>Jawna metodologia; wyniki należą do firmy; rekomendacje niezależne od wykonawcy</w:t>
             </w:r>
           </w:p>
@@ -2652,7 +4880,16 @@
             <w:tcW w:w="3120" w:type="dxa"/>
           </w:tcPr>
           <w:p>
-            <w:r>
+            <w:pPr>
+              <w:rPr>
+                <w:lang w:val="pl-PL"/>
+              </w:rPr>
+            </w:pPr>
+            <w:r>
+              <w:rPr>
+                <w:lang w:val="pl-PL"/>
+              </w:rPr>
+              <w:lastRenderedPageBreak/>
               <w:t>Firma wchodzi, by przykryć kryzys wizerunkowy</w:t>
             </w:r>
           </w:p>
@@ -2672,9 +4909,27 @@
             <w:tcW w:w="3120" w:type="dxa"/>
           </w:tcPr>
           <w:p>
-            <w:r>
-              <w:t>Filtr etyczny w kwalifikacji</w:t>
-            </w:r>
+            <w:proofErr w:type="spellStart"/>
+            <w:r>
+              <w:t>Filtr</w:t>
+            </w:r>
+            <w:proofErr w:type="spellEnd"/>
+            <w:r>
+              <w:t xml:space="preserve"> </w:t>
+            </w:r>
+            <w:proofErr w:type="spellStart"/>
+            <w:r>
+              <w:t>etyczny</w:t>
+            </w:r>
+            <w:proofErr w:type="spellEnd"/>
+            <w:r>
+              <w:t xml:space="preserve"> w </w:t>
+            </w:r>
+            <w:proofErr w:type="spellStart"/>
+            <w:r>
+              <w:t>kwalifikacji</w:t>
+            </w:r>
+            <w:proofErr w:type="spellEnd"/>
           </w:p>
         </w:tc>
       </w:tr>
@@ -2684,7 +4939,15 @@
             <w:tcW w:w="3120" w:type="dxa"/>
           </w:tcPr>
           <w:p>
-            <w:r>
+            <w:pPr>
+              <w:rPr>
+                <w:lang w:val="pl-PL"/>
+              </w:rPr>
+            </w:pPr>
+            <w:r>
+              <w:rPr>
+                <w:lang w:val="pl-PL"/>
+              </w:rPr>
               <w:t>RODO lub sprzeciw związków zawodowych</w:t>
             </w:r>
           </w:p>
@@ -2704,7 +4967,15 @@
             <w:tcW w:w="3120" w:type="dxa"/>
           </w:tcPr>
           <w:p>
-            <w:r>
+            <w:pPr>
+              <w:rPr>
+                <w:lang w:val="pl-PL"/>
+              </w:rPr>
+            </w:pPr>
+            <w:r>
+              <w:rPr>
+                <w:lang w:val="pl-PL"/>
+              </w:rPr>
               <w:t>Umowa powierzenia, próg anonimowości, wcześniejsza informacja dla związków</w:t>
             </w:r>
           </w:p>
@@ -2715,9 +4986,35 @@
       <w:pPr>
         <w:pStyle w:val="Nagwek2"/>
       </w:pPr>
-      <w:r>
-        <w:t>Przejrzystość i dalsze kroki</w:t>
-      </w:r>
+      <w:proofErr w:type="spellStart"/>
+      <w:r>
+        <w:t>Przejrzystość</w:t>
+      </w:r>
+      <w:proofErr w:type="spellEnd"/>
+      <w:r>
+        <w:t xml:space="preserve"> </w:t>
+      </w:r>
+      <w:proofErr w:type="spellStart"/>
+      <w:r>
+        <w:t>i</w:t>
+      </w:r>
+      <w:proofErr w:type="spellEnd"/>
+      <w:r>
+        <w:t xml:space="preserve"> </w:t>
+      </w:r>
+      <w:proofErr w:type="spellStart"/>
+      <w:r>
+        <w:t>dalsze</w:t>
+      </w:r>
+      <w:proofErr w:type="spellEnd"/>
+      <w:r>
+        <w:t xml:space="preserve"> </w:t>
+      </w:r>
+      <w:proofErr w:type="spellStart"/>
+      <w:r>
+        <w:t>kroki</w:t>
+      </w:r>
+      <w:proofErr w:type="spellEnd"/>
     </w:p>
     <w:tbl>
       <w:tblPr>
@@ -2740,9 +5037,19 @@
             <w:shd w:val="clear" w:color="auto" w:fill="F2F2F2"/>
           </w:tcPr>
           <w:p>
-            <w:r>
-              <w:t>Rodzaj informacji</w:t>
-            </w:r>
+            <w:proofErr w:type="spellStart"/>
+            <w:r>
+              <w:t>Rodzaj</w:t>
+            </w:r>
+            <w:proofErr w:type="spellEnd"/>
+            <w:r>
+              <w:t xml:space="preserve"> </w:t>
+            </w:r>
+            <w:proofErr w:type="spellStart"/>
+            <w:r>
+              <w:t>informacji</w:t>
+            </w:r>
+            <w:proofErr w:type="spellEnd"/>
           </w:p>
         </w:tc>
         <w:tc>
@@ -2752,8 +5059,13 @@
           </w:tcPr>
           <w:p>
             <w:r>
-              <w:t>Co obejmuje</w:t>
-            </w:r>
+              <w:t xml:space="preserve">Co </w:t>
+            </w:r>
+            <w:proofErr w:type="spellStart"/>
+            <w:r>
+              <w:t>obejmuje</w:t>
+            </w:r>
+            <w:proofErr w:type="spellEnd"/>
           </w:p>
         </w:tc>
       </w:tr>
@@ -2767,8 +5079,44 @@
               <w:rPr>
                 <w:b/>
               </w:rPr>
-              <w:t>Na podstawie materiałów fundacji</w:t>
-            </w:r>
+              <w:t xml:space="preserve">Na </w:t>
+            </w:r>
+            <w:proofErr w:type="spellStart"/>
+            <w:r>
+              <w:rPr>
+                <w:b/>
+              </w:rPr>
+              <w:t>podstawie</w:t>
+            </w:r>
+            <w:proofErr w:type="spellEnd"/>
+            <w:r>
+              <w:rPr>
+                <w:b/>
+              </w:rPr>
+              <w:t xml:space="preserve"> </w:t>
+            </w:r>
+            <w:proofErr w:type="spellStart"/>
+            <w:r>
+              <w:rPr>
+                <w:b/>
+              </w:rPr>
+              <w:t>materiałów</w:t>
+            </w:r>
+            <w:proofErr w:type="spellEnd"/>
+            <w:r>
+              <w:rPr>
+                <w:b/>
+              </w:rPr>
+              <w:t xml:space="preserve"> </w:t>
+            </w:r>
+            <w:proofErr w:type="spellStart"/>
+            <w:r>
+              <w:rPr>
+                <w:b/>
+              </w:rPr>
+              <w:t>fundacji</w:t>
+            </w:r>
+            <w:proofErr w:type="spellEnd"/>
           </w:p>
         </w:tc>
         <w:tc>
@@ -2776,7 +5124,15 @@
             <w:tcW w:w="4680" w:type="dxa"/>
           </w:tcPr>
           <w:p>
-            <w:r>
+            <w:pPr>
+              <w:rPr>
+                <w:lang w:val="pl-PL"/>
+              </w:rPr>
+            </w:pPr>
+            <w:r>
+              <w:rPr>
+                <w:lang w:val="pl-PL"/>
+              </w:rPr>
               <w:t>Liczby z raportu Ipsos, model 10 filarów, Macierz interwencji, decyzje o konferencji i kampanii</w:t>
             </w:r>
           </w:p>
@@ -2788,12 +5144,28 @@
             <w:tcW w:w="4680" w:type="dxa"/>
           </w:tcPr>
           <w:p>
+            <w:proofErr w:type="spellStart"/>
             <w:r>
               <w:rPr>
                 <w:b/>
               </w:rPr>
-              <w:t>Ocena zawodowa</w:t>
-            </w:r>
+              <w:t>Ocena</w:t>
+            </w:r>
+            <w:proofErr w:type="spellEnd"/>
+            <w:r>
+              <w:rPr>
+                <w:b/>
+              </w:rPr>
+              <w:t xml:space="preserve"> </w:t>
+            </w:r>
+            <w:proofErr w:type="spellStart"/>
+            <w:r>
+              <w:rPr>
+                <w:b/>
+              </w:rPr>
+              <w:t>zawodowa</w:t>
+            </w:r>
+            <w:proofErr w:type="spellEnd"/>
           </w:p>
         </w:tc>
         <w:tc>
@@ -2801,7 +5173,15 @@
             <w:tcW w:w="4680" w:type="dxa"/>
           </w:tcPr>
           <w:p>
-            <w:r>
+            <w:pPr>
+              <w:rPr>
+                <w:lang w:val="pl-PL"/>
+              </w:rPr>
+            </w:pPr>
+            <w:r>
+              <w:rPr>
+                <w:lang w:val="pl-PL"/>
+              </w:rPr>
               <w:t>Kolejność kroków, umowa dwuetapowa, czasy trwania, lista zagrożeń</w:t>
             </w:r>
           </w:p>
@@ -2817,8 +5197,16 @@
               <w:rPr>
                 <w:b/>
               </w:rPr>
-              <w:t>Do sprawdzenia</w:t>
-            </w:r>
+              <w:t xml:space="preserve">Do </w:t>
+            </w:r>
+            <w:proofErr w:type="spellStart"/>
+            <w:r>
+              <w:rPr>
+                <w:b/>
+              </w:rPr>
+              <w:t>sprawdzenia</w:t>
+            </w:r>
+            <w:proofErr w:type="spellEnd"/>
           </w:p>
         </w:tc>
         <w:tc>
@@ -2826,37 +5214,58 @@
             <w:tcW w:w="4680" w:type="dxa"/>
           </w:tcPr>
           <w:p>
-            <w:r>
-              <w:t xml:space="preserve">Realne czasy realizacji, zasoby fundacji do etapu </w:t>
-            </w:r>
-            <w:r>
-              <w:lastRenderedPageBreak/>
-              <w:t>2, warunki prawne (RODO, umowy)</w:t>
+            <w:pPr>
+              <w:rPr>
+                <w:lang w:val="pl-PL"/>
+              </w:rPr>
+            </w:pPr>
+            <w:r>
+              <w:rPr>
+                <w:lang w:val="pl-PL"/>
+              </w:rPr>
+              <w:t>Realne czasy realizacji, zasoby fundacji do etapu 2, warunki prawne (RODO, umowy)</w:t>
             </w:r>
           </w:p>
         </w:tc>
       </w:tr>
     </w:tbl>
     <w:p>
+      <w:pPr>
+        <w:rPr>
+          <w:lang w:val="pl-PL"/>
+        </w:rPr>
+      </w:pPr>
       <w:r>
         <w:rPr>
           <w:b/>
-        </w:rPr>
-        <w:lastRenderedPageBreak/>
+          <w:lang w:val="pl-PL"/>
+        </w:rPr>
         <w:t>Następny etap prac:</w:t>
       </w:r>
       <w:r>
+        <w:rPr>
+          <w:lang w:val="pl-PL"/>
+        </w:rPr>
         <w:t xml:space="preserve"> ankieta (treść i zgodność z badaniem Ipsos), Kalkulator (dane, założenia, sposób prezentacji) i diagnoza (zawartość raportu i spotkania z zarządem).</w:t>
       </w:r>
     </w:p>
     <w:p>
+      <w:pPr>
+        <w:rPr>
+          <w:lang w:val="pl-PL"/>
+        </w:rPr>
+      </w:pPr>
       <w:r>
         <w:rPr>
           <w:b/>
+          <w:lang w:val="pl-PL"/>
         </w:rPr>
         <w:t>Otwarte pytania na później:</w:t>
       </w:r>
       <w:r>
+        <w:rPr>
+          <w:lang w:val="pl-PL"/>
+        </w:rPr>
         <w:t xml:space="preserve"> płatne czy darmowe spotkanie z zarządem, umowa etapowa czy roczna, liczba klientów obsługiwanych równolegle, udział zarządu jako warunek konieczny.</w:t>
       </w:r>
     </w:p>
@@ -3709,6 +6118,23 @@
       </w:tblBorders>
     </w:tblPr>
   </w:style>
+  <w:style w:type="paragraph" w:styleId="NormalnyWeb">
+    <w:name w:val="Normal (Web)"/>
+    <w:basedOn w:val="Normalny"/>
+    <w:uiPriority w:val="99"/>
+    <w:semiHidden/>
+    <w:unhideWhenUsed/>
+    <w:rsid w:val="001D2FE3"/>
+    <w:pPr>
+      <w:spacing w:before="100" w:beforeAutospacing="1" w:after="100" w:afterAutospacing="1" w:line="240" w:lineRule="auto"/>
+    </w:pPr>
+    <w:rPr>
+      <w:rFonts w:ascii="Times New Roman" w:eastAsia="Times New Roman" w:hAnsi="Times New Roman" w:cs="Times New Roman"/>
+      <w:sz w:val="24"/>
+      <w:szCs w:val="24"/>
+      <w:lang w:val="pl-PL" w:eastAsia="zh-CN"/>
+    </w:rPr>
+  </w:style>
 </w:styles>
 </file>
 

</xml_diff>